<commit_message>
docs: refine portfolio transition contracts 1
</commit_message>
<xml_diff>
--- a/docs/IT-033-001 — Portfolio Transition Domain Model MVP.docx
+++ b/docs/IT-033-001 — Portfolio Transition Domain Model MVP.docx
@@ -732,7 +732,7 @@
       <w:pPr>
         <w:numPr>
           <w:ilvl w:val="0"/>
-          <w:numId w:val="20"/>
+          <w:numId w:val="21"/>
         </w:numPr>
         <w:spacing w:after="0" w:afterAutospacing="0" w:before="240" w:lineRule="auto"/>
         <w:ind w:left="720" w:hanging="360"/>
@@ -748,7 +748,7 @@
       <w:pPr>
         <w:numPr>
           <w:ilvl w:val="0"/>
-          <w:numId w:val="20"/>
+          <w:numId w:val="21"/>
         </w:numPr>
         <w:spacing w:after="0" w:afterAutospacing="0" w:before="0" w:beforeAutospacing="0" w:lineRule="auto"/>
         <w:ind w:left="720" w:hanging="360"/>
@@ -764,7 +764,7 @@
       <w:pPr>
         <w:numPr>
           <w:ilvl w:val="0"/>
-          <w:numId w:val="20"/>
+          <w:numId w:val="21"/>
         </w:numPr>
         <w:spacing w:after="0" w:afterAutospacing="0" w:before="0" w:beforeAutospacing="0" w:lineRule="auto"/>
         <w:ind w:left="720" w:hanging="360"/>
@@ -780,7 +780,7 @@
       <w:pPr>
         <w:numPr>
           <w:ilvl w:val="0"/>
-          <w:numId w:val="20"/>
+          <w:numId w:val="21"/>
         </w:numPr>
         <w:spacing w:after="0" w:afterAutospacing="0" w:before="0" w:beforeAutospacing="0" w:lineRule="auto"/>
         <w:ind w:left="720" w:hanging="360"/>
@@ -796,7 +796,7 @@
       <w:pPr>
         <w:numPr>
           <w:ilvl w:val="0"/>
-          <w:numId w:val="20"/>
+          <w:numId w:val="21"/>
         </w:numPr>
         <w:spacing w:after="0" w:afterAutospacing="0" w:before="0" w:beforeAutospacing="0" w:lineRule="auto"/>
         <w:ind w:left="720" w:hanging="360"/>
@@ -812,7 +812,7 @@
       <w:pPr>
         <w:numPr>
           <w:ilvl w:val="0"/>
-          <w:numId w:val="20"/>
+          <w:numId w:val="21"/>
         </w:numPr>
         <w:spacing w:after="0" w:afterAutospacing="0" w:before="0" w:beforeAutospacing="0" w:lineRule="auto"/>
         <w:ind w:left="720" w:hanging="360"/>
@@ -828,7 +828,7 @@
       <w:pPr>
         <w:numPr>
           <w:ilvl w:val="0"/>
-          <w:numId w:val="20"/>
+          <w:numId w:val="21"/>
         </w:numPr>
         <w:spacing w:after="0" w:afterAutospacing="0" w:before="0" w:beforeAutospacing="0" w:lineRule="auto"/>
         <w:ind w:left="720" w:hanging="360"/>
@@ -844,7 +844,7 @@
       <w:pPr>
         <w:numPr>
           <w:ilvl w:val="0"/>
-          <w:numId w:val="20"/>
+          <w:numId w:val="21"/>
         </w:numPr>
         <w:spacing w:after="0" w:afterAutospacing="0" w:before="0" w:beforeAutospacing="0" w:lineRule="auto"/>
         <w:ind w:left="720" w:hanging="360"/>
@@ -860,7 +860,7 @@
       <w:pPr>
         <w:numPr>
           <w:ilvl w:val="0"/>
-          <w:numId w:val="20"/>
+          <w:numId w:val="21"/>
         </w:numPr>
         <w:spacing w:after="0" w:afterAutospacing="0" w:before="0" w:beforeAutospacing="0" w:lineRule="auto"/>
         <w:ind w:left="720" w:hanging="360"/>
@@ -876,7 +876,7 @@
       <w:pPr>
         <w:numPr>
           <w:ilvl w:val="0"/>
-          <w:numId w:val="20"/>
+          <w:numId w:val="21"/>
         </w:numPr>
         <w:spacing w:after="0" w:afterAutospacing="0" w:before="0" w:beforeAutospacing="0" w:lineRule="auto"/>
         <w:ind w:left="720" w:hanging="360"/>
@@ -892,7 +892,7 @@
       <w:pPr>
         <w:numPr>
           <w:ilvl w:val="0"/>
-          <w:numId w:val="20"/>
+          <w:numId w:val="21"/>
         </w:numPr>
         <w:spacing w:after="240" w:before="0" w:beforeAutospacing="0" w:lineRule="auto"/>
         <w:ind w:left="720" w:hanging="360"/>
@@ -946,7 +946,7 @@
       <w:pPr>
         <w:numPr>
           <w:ilvl w:val="0"/>
-          <w:numId w:val="10"/>
+          <w:numId w:val="11"/>
         </w:numPr>
         <w:spacing w:after="0" w:afterAutospacing="0" w:before="240" w:lineRule="auto"/>
         <w:ind w:left="720" w:hanging="360"/>
@@ -962,7 +962,7 @@
       <w:pPr>
         <w:numPr>
           <w:ilvl w:val="0"/>
-          <w:numId w:val="10"/>
+          <w:numId w:val="11"/>
         </w:numPr>
         <w:spacing w:after="0" w:afterAutospacing="0" w:before="0" w:beforeAutospacing="0" w:lineRule="auto"/>
         <w:ind w:left="720" w:hanging="360"/>
@@ -978,7 +978,7 @@
       <w:pPr>
         <w:numPr>
           <w:ilvl w:val="0"/>
-          <w:numId w:val="10"/>
+          <w:numId w:val="11"/>
         </w:numPr>
         <w:spacing w:after="0" w:afterAutospacing="0" w:before="0" w:beforeAutospacing="0" w:lineRule="auto"/>
         <w:ind w:left="720" w:hanging="360"/>
@@ -994,7 +994,7 @@
       <w:pPr>
         <w:numPr>
           <w:ilvl w:val="0"/>
-          <w:numId w:val="10"/>
+          <w:numId w:val="11"/>
         </w:numPr>
         <w:spacing w:after="0" w:afterAutospacing="0" w:before="0" w:beforeAutospacing="0" w:lineRule="auto"/>
         <w:ind w:left="720" w:hanging="360"/>
@@ -1010,7 +1010,7 @@
       <w:pPr>
         <w:numPr>
           <w:ilvl w:val="0"/>
-          <w:numId w:val="10"/>
+          <w:numId w:val="11"/>
         </w:numPr>
         <w:spacing w:after="0" w:afterAutospacing="0" w:before="0" w:beforeAutospacing="0" w:lineRule="auto"/>
         <w:ind w:left="720" w:hanging="360"/>
@@ -1026,7 +1026,7 @@
       <w:pPr>
         <w:numPr>
           <w:ilvl w:val="0"/>
-          <w:numId w:val="10"/>
+          <w:numId w:val="11"/>
         </w:numPr>
         <w:spacing w:after="240" w:before="0" w:beforeAutospacing="0" w:lineRule="auto"/>
         <w:ind w:left="720" w:hanging="360"/>
@@ -1119,7 +1119,7 @@
       <w:pPr>
         <w:numPr>
           <w:ilvl w:val="0"/>
-          <w:numId w:val="5"/>
+          <w:numId w:val="6"/>
         </w:numPr>
         <w:spacing w:after="0" w:afterAutospacing="0" w:before="240" w:lineRule="auto"/>
         <w:ind w:left="720" w:hanging="360"/>
@@ -1135,7 +1135,7 @@
       <w:pPr>
         <w:numPr>
           <w:ilvl w:val="0"/>
-          <w:numId w:val="5"/>
+          <w:numId w:val="6"/>
         </w:numPr>
         <w:spacing w:after="240" w:before="0" w:beforeAutospacing="0" w:lineRule="auto"/>
         <w:ind w:left="720" w:hanging="360"/>
@@ -1189,7 +1189,7 @@
       <w:pPr>
         <w:numPr>
           <w:ilvl w:val="0"/>
-          <w:numId w:val="13"/>
+          <w:numId w:val="14"/>
         </w:numPr>
         <w:spacing w:after="0" w:afterAutospacing="0" w:before="240" w:lineRule="auto"/>
         <w:ind w:left="720" w:hanging="360"/>
@@ -1205,7 +1205,7 @@
       <w:pPr>
         <w:numPr>
           <w:ilvl w:val="0"/>
-          <w:numId w:val="13"/>
+          <w:numId w:val="14"/>
         </w:numPr>
         <w:spacing w:after="0" w:afterAutospacing="0" w:before="0" w:beforeAutospacing="0" w:lineRule="auto"/>
         <w:ind w:left="720" w:hanging="360"/>
@@ -1221,7 +1221,7 @@
       <w:pPr>
         <w:numPr>
           <w:ilvl w:val="0"/>
-          <w:numId w:val="13"/>
+          <w:numId w:val="14"/>
         </w:numPr>
         <w:spacing w:after="0" w:afterAutospacing="0" w:before="0" w:beforeAutospacing="0" w:lineRule="auto"/>
         <w:ind w:left="720" w:hanging="360"/>
@@ -1237,7 +1237,7 @@
       <w:pPr>
         <w:numPr>
           <w:ilvl w:val="0"/>
-          <w:numId w:val="13"/>
+          <w:numId w:val="14"/>
         </w:numPr>
         <w:spacing w:after="0" w:afterAutospacing="0" w:before="0" w:beforeAutospacing="0" w:lineRule="auto"/>
         <w:ind w:left="720" w:hanging="360"/>
@@ -1253,7 +1253,7 @@
       <w:pPr>
         <w:numPr>
           <w:ilvl w:val="0"/>
-          <w:numId w:val="13"/>
+          <w:numId w:val="14"/>
         </w:numPr>
         <w:spacing w:after="0" w:afterAutospacing="0" w:before="0" w:beforeAutospacing="0" w:lineRule="auto"/>
         <w:ind w:left="720" w:hanging="360"/>
@@ -1269,7 +1269,7 @@
       <w:pPr>
         <w:numPr>
           <w:ilvl w:val="0"/>
-          <w:numId w:val="13"/>
+          <w:numId w:val="14"/>
         </w:numPr>
         <w:spacing w:after="0" w:afterAutospacing="0" w:before="0" w:beforeAutospacing="0" w:lineRule="auto"/>
         <w:ind w:left="720" w:hanging="360"/>
@@ -1285,7 +1285,7 @@
       <w:pPr>
         <w:numPr>
           <w:ilvl w:val="0"/>
-          <w:numId w:val="13"/>
+          <w:numId w:val="14"/>
         </w:numPr>
         <w:spacing w:after="0" w:afterAutospacing="0" w:before="0" w:beforeAutospacing="0" w:lineRule="auto"/>
         <w:ind w:left="720" w:hanging="360"/>
@@ -1301,7 +1301,7 @@
       <w:pPr>
         <w:numPr>
           <w:ilvl w:val="0"/>
-          <w:numId w:val="13"/>
+          <w:numId w:val="14"/>
         </w:numPr>
         <w:spacing w:after="240" w:before="0" w:beforeAutospacing="0" w:lineRule="auto"/>
         <w:ind w:left="720" w:hanging="360"/>
@@ -1658,6 +1658,251 @@
     </w:p>
     <w:p>
       <w:pPr>
+        <w:pStyle w:val="Heading3"/>
+        <w:keepNext w:val="0"/>
+        <w:keepLines w:val="0"/>
+        <w:spacing w:before="280" w:lineRule="auto"/>
+        <w:rPr>
+          <w:rFonts w:ascii="Roboto Mono" w:cs="Roboto Mono" w:eastAsia="Roboto Mono" w:hAnsi="Roboto Mono"/>
+          <w:b w:val="1"/>
+          <w:bCs w:val="1"/>
+          <w:color w:val="188038"/>
+          <w:sz w:val="26"/>
+          <w:szCs w:val="26"/>
+        </w:rPr>
+      </w:pPr>
+      <w:bookmarkStart w:colFirst="0" w:colLast="0" w:name="_1l6qg0ukrys1" w:id="12"/>
+      <w:bookmarkEnd w:id="12"/>
+      <w:r>
+        <w:rPr>
+          <w:rFonts w:ascii="Roboto Mono" w:cs="Roboto Mono" w:eastAsia="Roboto Mono" w:hAnsi="Roboto Mono"/>
+          <w:b w:val="1"/>
+          <w:bCs w:val="1"/>
+          <w:color w:val="188038"/>
+          <w:sz w:val="26"/>
+          <w:szCs w:val="26"/>
+          <w:rtl w:val="0"/>
+        </w:rPr>
+        <w:t xml:space="preserve">8.2 — Estructura Pública de PortfolioTransition</w:t>
+      </w:r>
+    </w:p>
+    <w:p>
+      <w:pPr>
+        <w:spacing w:after="240" w:before="240" w:lineRule="auto"/>
+        <w:ind w:left="600" w:right="600" w:firstLine="0"/>
+        <w:rPr/>
+      </w:pPr>
+      <w:r>
+        <w:rPr>
+          <w:rtl w:val="0"/>
+        </w:rPr>
+        <w:t xml:space="preserve">El contrato público </w:t>
+      </w:r>
+      <w:r>
+        <w:rPr>
+          <w:rFonts w:ascii="Roboto Mono" w:cs="Roboto Mono" w:eastAsia="Roboto Mono" w:hAnsi="Roboto Mono"/>
+          <w:color w:val="188038"/>
+          <w:rtl w:val="0"/>
+        </w:rPr>
+        <w:t xml:space="preserve">PortfolioTransition</w:t>
+      </w:r>
+      <w:r>
+        <w:rPr>
+          <w:rtl w:val="0"/>
+        </w:rPr>
+        <w:t xml:space="preserve"> estará constituido exactamente por los siguientes campos:</w:t>
+      </w:r>
+    </w:p>
+    <w:p>
+      <w:pPr>
+        <w:spacing w:after="240" w:before="240" w:lineRule="auto"/>
+        <w:ind w:left="600" w:right="600" w:firstLine="0"/>
+        <w:rPr>
+          <w:rFonts w:ascii="Roboto Mono" w:cs="Roboto Mono" w:eastAsia="Roboto Mono" w:hAnsi="Roboto Mono"/>
+          <w:color w:val="188038"/>
+        </w:rPr>
+      </w:pPr>
+      <w:r>
+        <w:rPr>
+          <w:rFonts w:ascii="Roboto Mono" w:cs="Roboto Mono" w:eastAsia="Roboto Mono" w:hAnsi="Roboto Mono"/>
+          <w:color w:val="188038"/>
+          <w:rtl w:val="0"/>
+        </w:rPr>
+        <w:t xml:space="preserve">current_portfolio_state: PortfolioState</w:t>
+      </w:r>
+    </w:p>
+    <w:p>
+      <w:pPr>
+        <w:spacing w:after="240" w:before="240" w:lineRule="auto"/>
+        <w:ind w:left="600" w:right="600" w:firstLine="0"/>
+        <w:rPr>
+          <w:rFonts w:ascii="Roboto Mono" w:cs="Roboto Mono" w:eastAsia="Roboto Mono" w:hAnsi="Roboto Mono"/>
+          <w:color w:val="188038"/>
+        </w:rPr>
+      </w:pPr>
+      <w:r>
+        <w:rPr>
+          <w:rFonts w:ascii="Roboto Mono" w:cs="Roboto Mono" w:eastAsia="Roboto Mono" w:hAnsi="Roboto Mono"/>
+          <w:color w:val="188038"/>
+          <w:rtl w:val="0"/>
+        </w:rPr>
+        <w:t xml:space="preserve">target_portfolio_state: PortfolioState</w:t>
+      </w:r>
+    </w:p>
+    <w:p>
+      <w:pPr>
+        <w:spacing w:after="240" w:before="240" w:lineRule="auto"/>
+        <w:ind w:left="600" w:right="600" w:firstLine="0"/>
+        <w:rPr>
+          <w:rFonts w:ascii="Roboto Mono" w:cs="Roboto Mono" w:eastAsia="Roboto Mono" w:hAnsi="Roboto Mono"/>
+          <w:color w:val="188038"/>
+        </w:rPr>
+      </w:pPr>
+      <w:r>
+        <w:rPr>
+          <w:rFonts w:ascii="Roboto Mono" w:cs="Roboto Mono" w:eastAsia="Roboto Mono" w:hAnsi="Roboto Mono"/>
+          <w:color w:val="188038"/>
+          <w:rtl w:val="0"/>
+        </w:rPr>
+        <w:t xml:space="preserve">position_transitions: tuple[PortfolioPositionTransition, ...]</w:t>
+      </w:r>
+    </w:p>
+    <w:p>
+      <w:pPr>
+        <w:spacing w:after="240" w:before="240" w:lineRule="auto"/>
+        <w:ind w:left="600" w:right="600" w:firstLine="0"/>
+        <w:rPr>
+          <w:rFonts w:ascii="Roboto Mono" w:cs="Roboto Mono" w:eastAsia="Roboto Mono" w:hAnsi="Roboto Mono"/>
+          <w:color w:val="188038"/>
+        </w:rPr>
+      </w:pPr>
+      <w:r>
+        <w:rPr>
+          <w:rFonts w:ascii="Roboto Mono" w:cs="Roboto Mono" w:eastAsia="Roboto Mono" w:hAnsi="Roboto Mono"/>
+          <w:color w:val="188038"/>
+          <w:rtl w:val="0"/>
+        </w:rPr>
+        <w:t xml:space="preserve">monetary_transitions: tuple[PortfolioMonetaryTransition, ...]</w:t>
+      </w:r>
+    </w:p>
+    <w:p>
+      <w:pPr>
+        <w:spacing w:after="240" w:before="240" w:lineRule="auto"/>
+        <w:ind w:left="600" w:right="600" w:firstLine="0"/>
+        <w:rPr/>
+      </w:pPr>
+      <w:r>
+        <w:rPr>
+          <w:rtl w:val="0"/>
+        </w:rPr>
+        <w:t xml:space="preserve">No se autorizan campos públicos adicionales.</w:t>
+      </w:r>
+    </w:p>
+    <w:p>
+      <w:pPr>
+        <w:spacing w:after="240" w:before="240" w:lineRule="auto"/>
+        <w:ind w:left="600" w:right="600" w:firstLine="0"/>
+        <w:rPr/>
+      </w:pPr>
+      <w:r>
+        <w:rPr>
+          <w:rFonts w:ascii="Roboto Mono" w:cs="Roboto Mono" w:eastAsia="Roboto Mono" w:hAnsi="Roboto Mono"/>
+          <w:color w:val="188038"/>
+          <w:rtl w:val="0"/>
+        </w:rPr>
+        <w:t xml:space="preserve">current_portfolio_state</w:t>
+      </w:r>
+      <w:r>
+        <w:rPr>
+          <w:rtl w:val="0"/>
+        </w:rPr>
+        <w:t xml:space="preserve"> y </w:t>
+      </w:r>
+      <w:r>
+        <w:rPr>
+          <w:rFonts w:ascii="Roboto Mono" w:cs="Roboto Mono" w:eastAsia="Roboto Mono" w:hAnsi="Roboto Mono"/>
+          <w:color w:val="188038"/>
+          <w:rtl w:val="0"/>
+        </w:rPr>
+        <w:t xml:space="preserve">target_portfolio_state</w:t>
+      </w:r>
+      <w:r>
+        <w:rPr>
+          <w:rtl w:val="0"/>
+        </w:rPr>
+        <w:t xml:space="preserve"> son componentes obligatorios y constitutivos del activo.</w:t>
+      </w:r>
+    </w:p>
+    <w:p>
+      <w:pPr>
+        <w:spacing w:after="240" w:before="240" w:lineRule="auto"/>
+        <w:ind w:left="600" w:right="600" w:firstLine="0"/>
+        <w:rPr/>
+      </w:pPr>
+      <w:r>
+        <w:rPr>
+          <w:rFonts w:ascii="Roboto Mono" w:cs="Roboto Mono" w:eastAsia="Roboto Mono" w:hAnsi="Roboto Mono"/>
+          <w:color w:val="188038"/>
+          <w:rtl w:val="0"/>
+        </w:rPr>
+        <w:t xml:space="preserve">position_transitions</w:t>
+      </w:r>
+      <w:r>
+        <w:rPr>
+          <w:rtl w:val="0"/>
+        </w:rPr>
+        <w:t xml:space="preserve"> podrá contener cero o más transformaciones de posiciones.</w:t>
+      </w:r>
+    </w:p>
+    <w:p>
+      <w:pPr>
+        <w:spacing w:after="240" w:before="240" w:lineRule="auto"/>
+        <w:ind w:left="600" w:right="600" w:firstLine="0"/>
+        <w:rPr/>
+      </w:pPr>
+      <w:r>
+        <w:rPr>
+          <w:rFonts w:ascii="Roboto Mono" w:cs="Roboto Mono" w:eastAsia="Roboto Mono" w:hAnsi="Roboto Mono"/>
+          <w:color w:val="188038"/>
+          <w:rtl w:val="0"/>
+        </w:rPr>
+        <w:t xml:space="preserve">monetary_transitions</w:t>
+      </w:r>
+      <w:r>
+        <w:rPr>
+          <w:rtl w:val="0"/>
+        </w:rPr>
+        <w:t xml:space="preserve"> podrá contener cero o más transformaciones monetarias.</w:t>
+      </w:r>
+    </w:p>
+    <w:p>
+      <w:pPr>
+        <w:spacing w:after="240" w:before="240" w:lineRule="auto"/>
+        <w:ind w:left="600" w:right="600" w:firstLine="0"/>
+        <w:rPr/>
+      </w:pPr>
+      <w:r>
+        <w:rPr>
+          <w:rtl w:val="0"/>
+        </w:rPr>
+        <w:t xml:space="preserve">Al menos una de las dos colecciones deberá contener un componente material.</w:t>
+      </w:r>
+    </w:p>
+    <w:p>
+      <w:pPr>
+        <w:spacing w:after="240" w:before="240" w:lineRule="auto"/>
+        <w:ind w:left="600" w:right="600" w:firstLine="0"/>
+        <w:rPr/>
+      </w:pPr>
+      <w:r>
+        <w:rPr>
+          <w:rtl w:val="0"/>
+        </w:rPr>
+        <w:t xml:space="preserve">Las colecciones no poseen orden semántico. Su representación contractual será inmutable y canonicalizada de forma determinista conforme a la identidad semántica de las referencias públicas que identifican sus componentes.</w:t>
+      </w:r>
+    </w:p>
+    <w:p>
+      <w:pPr>
         <w:spacing w:after="240" w:before="240" w:lineRule="auto"/>
         <w:rPr/>
       </w:pPr>
@@ -1706,8 +1951,8 @@
           <w:szCs w:val="46"/>
         </w:rPr>
       </w:pPr>
-      <w:bookmarkStart w:colFirst="0" w:colLast="0" w:name="_j5lju9o3vhyt" w:id="12"/>
-      <w:bookmarkEnd w:id="12"/>
+      <w:bookmarkStart w:colFirst="0" w:colLast="0" w:name="_j5lju9o3vhyt" w:id="13"/>
+      <w:bookmarkEnd w:id="13"/>
       <w:r>
         <w:rPr>
           <w:b w:val="1"/>
@@ -1923,8 +2168,8 @@
           <w:szCs w:val="46"/>
         </w:rPr>
       </w:pPr>
-      <w:bookmarkStart w:colFirst="0" w:colLast="0" w:name="_6f4wwq630264" w:id="13"/>
-      <w:bookmarkEnd w:id="13"/>
+      <w:bookmarkStart w:colFirst="0" w:colLast="0" w:name="_6f4wwq630264" w:id="14"/>
+      <w:bookmarkEnd w:id="14"/>
       <w:r>
         <w:rPr>
           <w:b w:val="1"/>
@@ -1964,7 +2209,7 @@
       <w:pPr>
         <w:numPr>
           <w:ilvl w:val="0"/>
-          <w:numId w:val="17"/>
+          <w:numId w:val="18"/>
         </w:numPr>
         <w:spacing w:after="0" w:afterAutospacing="0" w:before="240" w:lineRule="auto"/>
         <w:ind w:left="720" w:hanging="360"/>
@@ -1980,7 +2225,7 @@
       <w:pPr>
         <w:numPr>
           <w:ilvl w:val="0"/>
-          <w:numId w:val="17"/>
+          <w:numId w:val="18"/>
         </w:numPr>
         <w:spacing w:after="0" w:afterAutospacing="0" w:before="0" w:beforeAutospacing="0" w:lineRule="auto"/>
         <w:ind w:left="720" w:hanging="360"/>
@@ -1996,7 +2241,7 @@
       <w:pPr>
         <w:numPr>
           <w:ilvl w:val="0"/>
-          <w:numId w:val="17"/>
+          <w:numId w:val="18"/>
         </w:numPr>
         <w:spacing w:after="240" w:before="0" w:beforeAutospacing="0" w:lineRule="auto"/>
         <w:ind w:left="720" w:hanging="360"/>
@@ -2024,7 +2269,7 @@
       <w:pPr>
         <w:numPr>
           <w:ilvl w:val="0"/>
-          <w:numId w:val="15"/>
+          <w:numId w:val="16"/>
         </w:numPr>
         <w:spacing w:after="0" w:afterAutospacing="0" w:before="240" w:lineRule="auto"/>
         <w:ind w:left="720" w:hanging="360"/>
@@ -2040,7 +2285,7 @@
       <w:pPr>
         <w:numPr>
           <w:ilvl w:val="0"/>
-          <w:numId w:val="15"/>
+          <w:numId w:val="16"/>
         </w:numPr>
         <w:spacing w:after="0" w:afterAutospacing="0" w:before="0" w:beforeAutospacing="0" w:lineRule="auto"/>
         <w:ind w:left="720" w:hanging="360"/>
@@ -2056,7 +2301,7 @@
       <w:pPr>
         <w:numPr>
           <w:ilvl w:val="0"/>
-          <w:numId w:val="15"/>
+          <w:numId w:val="16"/>
         </w:numPr>
         <w:spacing w:after="0" w:afterAutospacing="0" w:before="0" w:beforeAutospacing="0" w:lineRule="auto"/>
         <w:ind w:left="720" w:hanging="360"/>
@@ -2072,7 +2317,7 @@
       <w:pPr>
         <w:numPr>
           <w:ilvl w:val="0"/>
-          <w:numId w:val="15"/>
+          <w:numId w:val="16"/>
         </w:numPr>
         <w:spacing w:after="0" w:afterAutospacing="0" w:before="0" w:beforeAutospacing="0" w:lineRule="auto"/>
         <w:ind w:left="720" w:hanging="360"/>
@@ -2088,7 +2333,7 @@
       <w:pPr>
         <w:numPr>
           <w:ilvl w:val="0"/>
-          <w:numId w:val="15"/>
+          <w:numId w:val="16"/>
         </w:numPr>
         <w:spacing w:after="0" w:afterAutospacing="0" w:before="0" w:beforeAutospacing="0" w:lineRule="auto"/>
         <w:ind w:left="720" w:hanging="360"/>
@@ -2104,7 +2349,7 @@
       <w:pPr>
         <w:numPr>
           <w:ilvl w:val="0"/>
-          <w:numId w:val="15"/>
+          <w:numId w:val="16"/>
         </w:numPr>
         <w:spacing w:after="240" w:before="0" w:beforeAutospacing="0" w:lineRule="auto"/>
         <w:ind w:left="720" w:hanging="360"/>
@@ -2156,8 +2401,8 @@
           <w:szCs w:val="46"/>
         </w:rPr>
       </w:pPr>
-      <w:bookmarkStart w:colFirst="0" w:colLast="0" w:name="_eb72b3sn2rwk" w:id="14"/>
-      <w:bookmarkEnd w:id="14"/>
+      <w:bookmarkStart w:colFirst="0" w:colLast="0" w:name="_eb72b3sn2rwk" w:id="15"/>
+      <w:bookmarkEnd w:id="15"/>
       <w:r>
         <w:rPr>
           <w:b w:val="1"/>
@@ -2294,8 +2539,8 @@
           <w:szCs w:val="46"/>
         </w:rPr>
       </w:pPr>
-      <w:bookmarkStart w:colFirst="0" w:colLast="0" w:name="_78vfoph9l6ea" w:id="15"/>
-      <w:bookmarkEnd w:id="15"/>
+      <w:bookmarkStart w:colFirst="0" w:colLast="0" w:name="_78vfoph9l6ea" w:id="16"/>
+      <w:bookmarkEnd w:id="16"/>
       <w:r>
         <w:rPr>
           <w:b w:val="1"/>
@@ -2359,7 +2604,7 @@
       <w:pPr>
         <w:numPr>
           <w:ilvl w:val="0"/>
-          <w:numId w:val="11"/>
+          <w:numId w:val="12"/>
         </w:numPr>
         <w:spacing w:after="0" w:afterAutospacing="0" w:before="240" w:lineRule="auto"/>
         <w:ind w:left="720" w:hanging="360"/>
@@ -2375,7 +2620,7 @@
       <w:pPr>
         <w:numPr>
           <w:ilvl w:val="0"/>
-          <w:numId w:val="11"/>
+          <w:numId w:val="12"/>
         </w:numPr>
         <w:spacing w:after="0" w:afterAutospacing="0" w:before="0" w:beforeAutospacing="0" w:lineRule="auto"/>
         <w:ind w:left="720" w:hanging="360"/>
@@ -2405,7 +2650,7 @@
       <w:pPr>
         <w:numPr>
           <w:ilvl w:val="0"/>
-          <w:numId w:val="11"/>
+          <w:numId w:val="12"/>
         </w:numPr>
         <w:spacing w:after="240" w:before="0" w:beforeAutospacing="0" w:lineRule="auto"/>
         <w:ind w:left="720" w:hanging="360"/>
@@ -2457,8 +2702,8 @@
           <w:szCs w:val="46"/>
         </w:rPr>
       </w:pPr>
-      <w:bookmarkStart w:colFirst="0" w:colLast="0" w:name="_dwe2ub7xg0dx" w:id="16"/>
-      <w:bookmarkEnd w:id="16"/>
+      <w:bookmarkStart w:colFirst="0" w:colLast="0" w:name="_dwe2ub7xg0dx" w:id="17"/>
+      <w:bookmarkEnd w:id="17"/>
       <w:r>
         <w:rPr>
           <w:b w:val="1"/>
@@ -2498,7 +2743,7 @@
       <w:pPr>
         <w:numPr>
           <w:ilvl w:val="0"/>
-          <w:numId w:val="14"/>
+          <w:numId w:val="15"/>
         </w:numPr>
         <w:spacing w:after="0" w:afterAutospacing="0" w:before="240" w:lineRule="auto"/>
         <w:ind w:left="720" w:hanging="360"/>
@@ -2514,7 +2759,7 @@
       <w:pPr>
         <w:numPr>
           <w:ilvl w:val="0"/>
-          <w:numId w:val="14"/>
+          <w:numId w:val="15"/>
         </w:numPr>
         <w:spacing w:after="0" w:afterAutospacing="0" w:before="0" w:beforeAutospacing="0" w:lineRule="auto"/>
         <w:ind w:left="720" w:hanging="360"/>
@@ -2530,7 +2775,7 @@
       <w:pPr>
         <w:numPr>
           <w:ilvl w:val="0"/>
-          <w:numId w:val="14"/>
+          <w:numId w:val="15"/>
         </w:numPr>
         <w:spacing w:after="0" w:afterAutospacing="0" w:before="0" w:beforeAutospacing="0" w:lineRule="auto"/>
         <w:ind w:left="720" w:hanging="360"/>
@@ -2546,7 +2791,7 @@
       <w:pPr>
         <w:numPr>
           <w:ilvl w:val="0"/>
-          <w:numId w:val="14"/>
+          <w:numId w:val="15"/>
         </w:numPr>
         <w:spacing w:after="240" w:before="0" w:beforeAutospacing="0" w:lineRule="auto"/>
         <w:ind w:left="720" w:hanging="360"/>
@@ -2610,8 +2855,8 @@
           <w:szCs w:val="46"/>
         </w:rPr>
       </w:pPr>
-      <w:bookmarkStart w:colFirst="0" w:colLast="0" w:name="_5rd46zefkscp" w:id="17"/>
-      <w:bookmarkEnd w:id="17"/>
+      <w:bookmarkStart w:colFirst="0" w:colLast="0" w:name="_5rd46zefkscp" w:id="18"/>
+      <w:bookmarkEnd w:id="18"/>
       <w:r>
         <w:rPr>
           <w:b w:val="1"/>
@@ -2663,8 +2908,8 @@
           <w:szCs w:val="34"/>
         </w:rPr>
       </w:pPr>
-      <w:bookmarkStart w:colFirst="0" w:colLast="0" w:name="_kbm3nyoktptm" w:id="18"/>
-      <w:bookmarkEnd w:id="18"/>
+      <w:bookmarkStart w:colFirst="0" w:colLast="0" w:name="_kbm3nyoktptm" w:id="19"/>
+      <w:bookmarkEnd w:id="19"/>
       <w:r>
         <w:rPr>
           <w:b w:val="1"/>
@@ -2740,8 +2985,8 @@
           <w:szCs w:val="34"/>
         </w:rPr>
       </w:pPr>
-      <w:bookmarkStart w:colFirst="0" w:colLast="0" w:name="_94ikh01tpmb1" w:id="19"/>
-      <w:bookmarkEnd w:id="19"/>
+      <w:bookmarkStart w:colFirst="0" w:colLast="0" w:name="_94ikh01tpmb1" w:id="20"/>
+      <w:bookmarkEnd w:id="20"/>
       <w:r>
         <w:rPr>
           <w:b w:val="1"/>
@@ -2769,7 +3014,7 @@
       <w:pPr>
         <w:numPr>
           <w:ilvl w:val="0"/>
-          <w:numId w:val="8"/>
+          <w:numId w:val="9"/>
         </w:numPr>
         <w:spacing w:after="0" w:afterAutospacing="0" w:before="240" w:lineRule="auto"/>
         <w:ind w:left="720" w:hanging="360"/>
@@ -2785,7 +3030,7 @@
       <w:pPr>
         <w:numPr>
           <w:ilvl w:val="0"/>
-          <w:numId w:val="8"/>
+          <w:numId w:val="9"/>
         </w:numPr>
         <w:spacing w:after="0" w:afterAutospacing="0" w:before="0" w:beforeAutospacing="0" w:lineRule="auto"/>
         <w:ind w:left="720" w:hanging="360"/>
@@ -2801,7 +3046,7 @@
       <w:pPr>
         <w:numPr>
           <w:ilvl w:val="0"/>
-          <w:numId w:val="8"/>
+          <w:numId w:val="9"/>
         </w:numPr>
         <w:spacing w:after="240" w:before="0" w:beforeAutospacing="0" w:lineRule="auto"/>
         <w:ind w:left="720" w:hanging="360"/>
@@ -2829,7 +3074,7 @@
       <w:pPr>
         <w:numPr>
           <w:ilvl w:val="0"/>
-          <w:numId w:val="19"/>
+          <w:numId w:val="20"/>
         </w:numPr>
         <w:spacing w:after="0" w:afterAutospacing="0" w:before="240" w:lineRule="auto"/>
         <w:ind w:left="720" w:hanging="360"/>
@@ -2845,7 +3090,7 @@
       <w:pPr>
         <w:numPr>
           <w:ilvl w:val="0"/>
-          <w:numId w:val="19"/>
+          <w:numId w:val="20"/>
         </w:numPr>
         <w:spacing w:after="0" w:afterAutospacing="0" w:before="0" w:beforeAutospacing="0" w:lineRule="auto"/>
         <w:ind w:left="720" w:hanging="360"/>
@@ -2861,7 +3106,7 @@
       <w:pPr>
         <w:numPr>
           <w:ilvl w:val="0"/>
-          <w:numId w:val="19"/>
+          <w:numId w:val="20"/>
         </w:numPr>
         <w:spacing w:after="0" w:afterAutospacing="0" w:before="0" w:beforeAutospacing="0" w:lineRule="auto"/>
         <w:ind w:left="720" w:hanging="360"/>
@@ -2877,7 +3122,7 @@
       <w:pPr>
         <w:numPr>
           <w:ilvl w:val="0"/>
-          <w:numId w:val="19"/>
+          <w:numId w:val="20"/>
         </w:numPr>
         <w:spacing w:after="0" w:afterAutospacing="0" w:before="0" w:beforeAutospacing="0" w:lineRule="auto"/>
         <w:ind w:left="720" w:hanging="360"/>
@@ -2893,7 +3138,7 @@
       <w:pPr>
         <w:numPr>
           <w:ilvl w:val="0"/>
-          <w:numId w:val="19"/>
+          <w:numId w:val="20"/>
         </w:numPr>
         <w:spacing w:after="240" w:before="0" w:beforeAutospacing="0" w:lineRule="auto"/>
         <w:ind w:left="720" w:hanging="360"/>
@@ -2933,8 +3178,8 @@
           <w:szCs w:val="34"/>
         </w:rPr>
       </w:pPr>
-      <w:bookmarkStart w:colFirst="0" w:colLast="0" w:name="_7sid3haid73r" w:id="20"/>
-      <w:bookmarkEnd w:id="20"/>
+      <w:bookmarkStart w:colFirst="0" w:colLast="0" w:name="_7sid3haid73r" w:id="21"/>
+      <w:bookmarkEnd w:id="21"/>
       <w:r>
         <w:rPr>
           <w:b w:val="1"/>
@@ -2974,7 +3219,7 @@
       <w:pPr>
         <w:numPr>
           <w:ilvl w:val="0"/>
-          <w:numId w:val="6"/>
+          <w:numId w:val="7"/>
         </w:numPr>
         <w:spacing w:after="0" w:afterAutospacing="0" w:before="240" w:lineRule="auto"/>
         <w:ind w:left="720" w:hanging="360"/>
@@ -2990,7 +3235,7 @@
       <w:pPr>
         <w:numPr>
           <w:ilvl w:val="0"/>
-          <w:numId w:val="6"/>
+          <w:numId w:val="7"/>
         </w:numPr>
         <w:spacing w:after="0" w:afterAutospacing="0" w:before="0" w:beforeAutospacing="0" w:lineRule="auto"/>
         <w:ind w:left="720" w:hanging="360"/>
@@ -3006,7 +3251,7 @@
       <w:pPr>
         <w:numPr>
           <w:ilvl w:val="0"/>
-          <w:numId w:val="6"/>
+          <w:numId w:val="7"/>
         </w:numPr>
         <w:spacing w:after="0" w:afterAutospacing="0" w:before="0" w:beforeAutospacing="0" w:lineRule="auto"/>
         <w:ind w:left="720" w:hanging="360"/>
@@ -3022,7 +3267,7 @@
       <w:pPr>
         <w:numPr>
           <w:ilvl w:val="0"/>
-          <w:numId w:val="6"/>
+          <w:numId w:val="7"/>
         </w:numPr>
         <w:spacing w:after="240" w:before="0" w:beforeAutospacing="0" w:lineRule="auto"/>
         <w:ind w:left="720" w:hanging="360"/>
@@ -3062,8 +3307,8 @@
           <w:szCs w:val="34"/>
         </w:rPr>
       </w:pPr>
-      <w:bookmarkStart w:colFirst="0" w:colLast="0" w:name="_gc37vps3ylsa" w:id="21"/>
-      <w:bookmarkEnd w:id="21"/>
+      <w:bookmarkStart w:colFirst="0" w:colLast="0" w:name="_gc37vps3ylsa" w:id="22"/>
+      <w:bookmarkEnd w:id="22"/>
       <w:r>
         <w:rPr>
           <w:b w:val="1"/>
@@ -3117,7 +3362,7 @@
       <w:pPr>
         <w:numPr>
           <w:ilvl w:val="0"/>
-          <w:numId w:val="9"/>
+          <w:numId w:val="10"/>
         </w:numPr>
         <w:spacing w:after="0" w:afterAutospacing="0" w:before="240" w:lineRule="auto"/>
         <w:ind w:left="720" w:hanging="360"/>
@@ -3133,7 +3378,7 @@
       <w:pPr>
         <w:numPr>
           <w:ilvl w:val="0"/>
-          <w:numId w:val="9"/>
+          <w:numId w:val="10"/>
         </w:numPr>
         <w:spacing w:after="0" w:afterAutospacing="0" w:before="0" w:beforeAutospacing="0" w:lineRule="auto"/>
         <w:ind w:left="720" w:hanging="360"/>
@@ -3149,7 +3394,7 @@
       <w:pPr>
         <w:numPr>
           <w:ilvl w:val="0"/>
-          <w:numId w:val="9"/>
+          <w:numId w:val="10"/>
         </w:numPr>
         <w:spacing w:after="240" w:before="0" w:beforeAutospacing="0" w:lineRule="auto"/>
         <w:ind w:left="720" w:hanging="360"/>
@@ -3197,8 +3442,8 @@
           <w:szCs w:val="34"/>
         </w:rPr>
       </w:pPr>
-      <w:bookmarkStart w:colFirst="0" w:colLast="0" w:name="_qljd2uuchkc9" w:id="22"/>
-      <w:bookmarkEnd w:id="22"/>
+      <w:bookmarkStart w:colFirst="0" w:colLast="0" w:name="_qljd2uuchkc9" w:id="23"/>
+      <w:bookmarkEnd w:id="23"/>
       <w:r>
         <w:rPr>
           <w:b w:val="1"/>
@@ -3248,8 +3493,8 @@
           <w:szCs w:val="26"/>
         </w:rPr>
       </w:pPr>
-      <w:bookmarkStart w:colFirst="0" w:colLast="0" w:name="_8m27khp6k3br" w:id="23"/>
-      <w:bookmarkEnd w:id="23"/>
+      <w:bookmarkStart w:colFirst="0" w:colLast="0" w:name="_8m27khp6k3br" w:id="24"/>
+      <w:bookmarkEnd w:id="24"/>
       <w:r>
         <w:rPr>
           <w:b w:val="1"/>
@@ -3337,8 +3582,8 @@
           <w:szCs w:val="26"/>
         </w:rPr>
       </w:pPr>
-      <w:bookmarkStart w:colFirst="0" w:colLast="0" w:name="_6r9fa36mm955" w:id="24"/>
-      <w:bookmarkEnd w:id="24"/>
+      <w:bookmarkStart w:colFirst="0" w:colLast="0" w:name="_6r9fa36mm955" w:id="25"/>
+      <w:bookmarkEnd w:id="25"/>
       <w:r>
         <w:rPr>
           <w:b w:val="1"/>
@@ -3388,8 +3633,8 @@
           <w:szCs w:val="26"/>
         </w:rPr>
       </w:pPr>
-      <w:bookmarkStart w:colFirst="0" w:colLast="0" w:name="_gpvz81ah0nk" w:id="25"/>
-      <w:bookmarkEnd w:id="25"/>
+      <w:bookmarkStart w:colFirst="0" w:colLast="0" w:name="_gpvz81ah0nk" w:id="26"/>
+      <w:bookmarkEnd w:id="26"/>
       <w:r>
         <w:rPr>
           <w:b w:val="1"/>
@@ -3464,7 +3709,7 @@
       <w:pPr>
         <w:numPr>
           <w:ilvl w:val="0"/>
-          <w:numId w:val="16"/>
+          <w:numId w:val="17"/>
         </w:numPr>
         <w:spacing w:after="0" w:afterAutospacing="0" w:before="240" w:lineRule="auto"/>
         <w:ind w:left="1440" w:hanging="360"/>
@@ -3480,7 +3725,7 @@
       <w:pPr>
         <w:numPr>
           <w:ilvl w:val="0"/>
-          <w:numId w:val="16"/>
+          <w:numId w:val="17"/>
         </w:numPr>
         <w:spacing w:after="0" w:afterAutospacing="0" w:before="0" w:beforeAutospacing="0" w:lineRule="auto"/>
         <w:ind w:left="1440" w:hanging="360"/>
@@ -3496,7 +3741,7 @@
       <w:pPr>
         <w:numPr>
           <w:ilvl w:val="0"/>
-          <w:numId w:val="16"/>
+          <w:numId w:val="17"/>
         </w:numPr>
         <w:spacing w:after="240" w:before="0" w:beforeAutospacing="0" w:lineRule="auto"/>
         <w:ind w:left="1440" w:hanging="360"/>
@@ -3527,8 +3772,8 @@
           <w:szCs w:val="26"/>
         </w:rPr>
       </w:pPr>
-      <w:bookmarkStart w:colFirst="0" w:colLast="0" w:name="_xnfl9z4lrlsc" w:id="26"/>
-      <w:bookmarkEnd w:id="26"/>
+      <w:bookmarkStart w:colFirst="0" w:colLast="0" w:name="_xnfl9z4lrlsc" w:id="27"/>
+      <w:bookmarkEnd w:id="27"/>
       <w:r>
         <w:rPr>
           <w:b w:val="1"/>
@@ -3598,8 +3843,8 @@
           <w:szCs w:val="34"/>
         </w:rPr>
       </w:pPr>
-      <w:bookmarkStart w:colFirst="0" w:colLast="0" w:name="_qtknvlnbo4pj" w:id="27"/>
-      <w:bookmarkEnd w:id="27"/>
+      <w:bookmarkStart w:colFirst="0" w:colLast="0" w:name="_qtknvlnbo4pj" w:id="28"/>
+      <w:bookmarkEnd w:id="28"/>
       <w:r>
         <w:rPr>
           <w:b w:val="1"/>
@@ -3644,6 +3889,134 @@
           <v:rect style="width:0.0pt;height:1.5pt" o:hr="t" o:hrstd="t" o:hralign="center" fillcolor="#A0A0A0" stroked="f"/>
         </w:pict>
       </w:r>
+      <w:r>
+        <w:rPr>
+          <w:rtl w:val="0"/>
+        </w:rPr>
+      </w:r>
+    </w:p>
+    <w:p>
+      <w:pPr>
+        <w:pStyle w:val="Heading3"/>
+        <w:keepNext w:val="0"/>
+        <w:keepLines w:val="0"/>
+        <w:spacing w:before="280" w:lineRule="auto"/>
+        <w:rPr>
+          <w:b w:val="1"/>
+          <w:bCs w:val="1"/>
+          <w:color w:val="000000"/>
+          <w:sz w:val="26"/>
+          <w:szCs w:val="26"/>
+        </w:rPr>
+      </w:pPr>
+      <w:bookmarkStart w:colFirst="0" w:colLast="0" w:name="_267zad3pauvf" w:id="29"/>
+      <w:bookmarkEnd w:id="29"/>
+      <w:r>
+        <w:rPr>
+          <w:b w:val="1"/>
+          <w:bCs w:val="1"/>
+          <w:color w:val="000000"/>
+          <w:sz w:val="34"/>
+          <w:szCs w:val="34"/>
+          <w:rtl w:val="0"/>
+        </w:rPr>
+        <w:t xml:space="preserve">IM-007 — Composición Contractual</w:t>
+      </w:r>
+      <w:r>
+        <w:rPr>
+          <w:rtl w:val="0"/>
+        </w:rPr>
+      </w:r>
+    </w:p>
+    <w:p>
+      <w:pPr>
+        <w:spacing w:after="240" w:before="240" w:lineRule="auto"/>
+        <w:ind w:left="600" w:right="600" w:firstLine="0"/>
+        <w:rPr/>
+      </w:pPr>
+      <w:r>
+        <w:rPr>
+          <w:rtl w:val="0"/>
+        </w:rPr>
+        <w:t xml:space="preserve">PortfolioTransition deberá contener exactamente un Current Portfolio State, exactamente un Target Portfolio State y las colecciones canónicas de transformaciones de posiciones y monetarias.</w:t>
+      </w:r>
+    </w:p>
+    <w:p>
+      <w:pPr>
+        <w:spacing w:after="240" w:before="240" w:lineRule="auto"/>
+        <w:ind w:left="600" w:right="600" w:firstLine="0"/>
+        <w:rPr/>
+      </w:pPr>
+      <w:r>
+        <w:rPr>
+          <w:rtl w:val="0"/>
+        </w:rPr>
+        <w:t xml:space="preserve">Ningún componente adicional podrá participar en la representación pública del activo.</w:t>
+      </w:r>
+    </w:p>
+    <w:p>
+      <w:pPr>
+        <w:pStyle w:val="Heading3"/>
+        <w:keepNext w:val="0"/>
+        <w:keepLines w:val="0"/>
+        <w:spacing w:before="280" w:lineRule="auto"/>
+        <w:rPr>
+          <w:b w:val="1"/>
+          <w:bCs w:val="1"/>
+          <w:color w:val="000000"/>
+          <w:sz w:val="26"/>
+          <w:szCs w:val="26"/>
+        </w:rPr>
+      </w:pPr>
+      <w:bookmarkStart w:colFirst="0" w:colLast="0" w:name="_ohh6iba2a9fj" w:id="30"/>
+      <w:bookmarkEnd w:id="30"/>
+      <w:r>
+        <w:rPr>
+          <w:b w:val="1"/>
+          <w:bCs w:val="1"/>
+          <w:color w:val="000000"/>
+          <w:sz w:val="34"/>
+          <w:szCs w:val="34"/>
+          <w:rtl w:val="0"/>
+        </w:rPr>
+        <w:t xml:space="preserve">IM-008 — Materialidad</w:t>
+      </w:r>
+      <w:r>
+        <w:rPr>
+          <w:rtl w:val="0"/>
+        </w:rPr>
+      </w:r>
+    </w:p>
+    <w:p>
+      <w:pPr>
+        <w:spacing w:after="240" w:before="240" w:lineRule="auto"/>
+        <w:ind w:left="600" w:right="600" w:firstLine="0"/>
+        <w:rPr/>
+      </w:pPr>
+      <w:r>
+        <w:rPr>
+          <w:rtl w:val="0"/>
+        </w:rPr>
+        <w:t xml:space="preserve">Una transición deberá contener al menos una transformación material.</w:t>
+      </w:r>
+    </w:p>
+    <w:p>
+      <w:pPr>
+        <w:spacing w:after="240" w:before="240" w:lineRule="auto"/>
+        <w:ind w:left="600" w:right="600" w:firstLine="0"/>
+        <w:rPr/>
+      </w:pPr>
+      <w:r>
+        <w:rPr>
+          <w:rtl w:val="0"/>
+        </w:rPr>
+        <w:t xml:space="preserve">Una transición cuyas colecciones de transformaciones estén ambas vacías no constituirá un PortfolioTransition válido.</w:t>
+      </w:r>
+    </w:p>
+    <w:p>
+      <w:pPr>
+        <w:rPr/>
+      </w:pPr>
       <w:r>
         <w:rPr>
           <w:rtl w:val="0"/>
@@ -3683,8 +4056,8 @@
           <w:szCs w:val="46"/>
         </w:rPr>
       </w:pPr>
-      <w:bookmarkStart w:colFirst="0" w:colLast="0" w:name="_bwccafh80ixa" w:id="28"/>
-      <w:bookmarkEnd w:id="28"/>
+      <w:bookmarkStart w:colFirst="0" w:colLast="0" w:name="_bwccafh80ixa" w:id="31"/>
+      <w:bookmarkEnd w:id="31"/>
       <w:r>
         <w:rPr>
           <w:b w:val="1"/>
@@ -3736,8 +4109,8 @@
           <w:szCs w:val="34"/>
         </w:rPr>
       </w:pPr>
-      <w:bookmarkStart w:colFirst="0" w:colLast="0" w:name="_zczp3os3ajy2" w:id="29"/>
-      <w:bookmarkEnd w:id="29"/>
+      <w:bookmarkStart w:colFirst="0" w:colLast="0" w:name="_zczp3os3ajy2" w:id="32"/>
+      <w:bookmarkEnd w:id="32"/>
       <w:r>
         <w:rPr>
           <w:b w:val="1"/>
@@ -3801,8 +4174,8 @@
           <w:szCs w:val="34"/>
         </w:rPr>
       </w:pPr>
-      <w:bookmarkStart w:colFirst="0" w:colLast="0" w:name="_jritj92eh85t" w:id="30"/>
-      <w:bookmarkEnd w:id="30"/>
+      <w:bookmarkStart w:colFirst="0" w:colLast="0" w:name="_jritj92eh85t" w:id="33"/>
+      <w:bookmarkEnd w:id="33"/>
       <w:r>
         <w:rPr>
           <w:b w:val="1"/>
@@ -3854,8 +4227,8 @@
           <w:szCs w:val="34"/>
         </w:rPr>
       </w:pPr>
-      <w:bookmarkStart w:colFirst="0" w:colLast="0" w:name="_phk7y4qtf5z2" w:id="31"/>
-      <w:bookmarkEnd w:id="31"/>
+      <w:bookmarkStart w:colFirst="0" w:colLast="0" w:name="_phk7y4qtf5z2" w:id="34"/>
+      <w:bookmarkEnd w:id="34"/>
       <w:r>
         <w:rPr>
           <w:b w:val="1"/>
@@ -3943,8 +4316,8 @@
           <w:szCs w:val="34"/>
         </w:rPr>
       </w:pPr>
-      <w:bookmarkStart w:colFirst="0" w:colLast="0" w:name="_40xs25u16wem" w:id="32"/>
-      <w:bookmarkEnd w:id="32"/>
+      <w:bookmarkStart w:colFirst="0" w:colLast="0" w:name="_40xs25u16wem" w:id="35"/>
+      <w:bookmarkEnd w:id="35"/>
       <w:r>
         <w:rPr>
           <w:b w:val="1"/>
@@ -4008,8 +4381,8 @@
           <w:szCs w:val="34"/>
         </w:rPr>
       </w:pPr>
-      <w:bookmarkStart w:colFirst="0" w:colLast="0" w:name="_1v3kpfda179y" w:id="33"/>
-      <w:bookmarkEnd w:id="33"/>
+      <w:bookmarkStart w:colFirst="0" w:colLast="0" w:name="_1v3kpfda179y" w:id="36"/>
+      <w:bookmarkEnd w:id="36"/>
       <w:r>
         <w:rPr>
           <w:b w:val="1"/>
@@ -4031,6 +4404,296 @@
           <w:rtl w:val="0"/>
         </w:rPr>
         <w:t xml:space="preserve">Toda representación de la transformación deberá cumplir las invariantes definidas por DOC-033.</w:t>
+      </w:r>
+    </w:p>
+    <w:p>
+      <w:pPr>
+        <w:spacing w:after="240" w:before="240" w:lineRule="auto"/>
+        <w:rPr/>
+      </w:pPr>
+      <w:r>
+        <w:rPr>
+          <w:rtl w:val="0"/>
+        </w:rPr>
+      </w:r>
+    </w:p>
+    <w:p>
+      <w:pPr>
+        <w:pStyle w:val="Heading2"/>
+        <w:keepNext w:val="0"/>
+        <w:keepLines w:val="0"/>
+        <w:spacing w:before="280" w:lineRule="auto"/>
+        <w:rPr/>
+      </w:pPr>
+      <w:bookmarkStart w:colFirst="0" w:colLast="0" w:name="_xioc0eligv5y" w:id="37"/>
+      <w:bookmarkEnd w:id="37"/>
+      <w:r>
+        <w:rPr>
+          <w:rtl w:val="0"/>
+        </w:rPr>
+        <w:t xml:space="preserve">VE-006</w:t>
+      </w:r>
+    </w:p>
+    <w:p>
+      <w:pPr>
+        <w:spacing w:after="240" w:before="240" w:lineRule="auto"/>
+        <w:ind w:left="600" w:right="600" w:firstLine="0"/>
+        <w:rPr/>
+      </w:pPr>
+      <w:r>
+        <w:rPr>
+          <w:rFonts w:ascii="Roboto Mono" w:cs="Roboto Mono" w:eastAsia="Roboto Mono" w:hAnsi="Roboto Mono"/>
+          <w:color w:val="188038"/>
+          <w:rtl w:val="0"/>
+        </w:rPr>
+        <w:t xml:space="preserve">current_portfolio_state</w:t>
+      </w:r>
+      <w:r>
+        <w:rPr>
+          <w:rtl w:val="0"/>
+        </w:rPr>
+        <w:t xml:space="preserve"> deberá existir y ser una instancia arquitectónicamente válida de </w:t>
+      </w:r>
+      <w:r>
+        <w:rPr>
+          <w:rFonts w:ascii="Roboto Mono" w:cs="Roboto Mono" w:eastAsia="Roboto Mono" w:hAnsi="Roboto Mono"/>
+          <w:color w:val="188038"/>
+          <w:rtl w:val="0"/>
+        </w:rPr>
+        <w:t xml:space="preserve">PortfolioState</w:t>
+      </w:r>
+      <w:r>
+        <w:rPr>
+          <w:rtl w:val="0"/>
+        </w:rPr>
+        <w:t xml:space="preserve">.</w:t>
+      </w:r>
+    </w:p>
+    <w:p>
+      <w:pPr>
+        <w:pStyle w:val="Heading2"/>
+        <w:keepNext w:val="0"/>
+        <w:keepLines w:val="0"/>
+        <w:spacing w:before="280" w:lineRule="auto"/>
+        <w:rPr/>
+      </w:pPr>
+      <w:bookmarkStart w:colFirst="0" w:colLast="0" w:name="_3npnl6koej6h" w:id="38"/>
+      <w:bookmarkEnd w:id="38"/>
+      <w:r>
+        <w:rPr>
+          <w:rtl w:val="0"/>
+        </w:rPr>
+        <w:t xml:space="preserve">VE-007</w:t>
+      </w:r>
+    </w:p>
+    <w:p>
+      <w:pPr>
+        <w:spacing w:after="240" w:before="240" w:lineRule="auto"/>
+        <w:ind w:left="600" w:right="600" w:firstLine="0"/>
+        <w:rPr/>
+      </w:pPr>
+      <w:r>
+        <w:rPr>
+          <w:rFonts w:ascii="Roboto Mono" w:cs="Roboto Mono" w:eastAsia="Roboto Mono" w:hAnsi="Roboto Mono"/>
+          <w:color w:val="188038"/>
+          <w:rtl w:val="0"/>
+        </w:rPr>
+        <w:t xml:space="preserve">target_portfolio_state</w:t>
+      </w:r>
+      <w:r>
+        <w:rPr>
+          <w:rtl w:val="0"/>
+        </w:rPr>
+        <w:t xml:space="preserve"> deberá existir y ser una instancia arquitectónicamente válida de </w:t>
+      </w:r>
+      <w:r>
+        <w:rPr>
+          <w:rFonts w:ascii="Roboto Mono" w:cs="Roboto Mono" w:eastAsia="Roboto Mono" w:hAnsi="Roboto Mono"/>
+          <w:color w:val="188038"/>
+          <w:rtl w:val="0"/>
+        </w:rPr>
+        <w:t xml:space="preserve">PortfolioState</w:t>
+      </w:r>
+      <w:r>
+        <w:rPr>
+          <w:rtl w:val="0"/>
+        </w:rPr>
+        <w:t xml:space="preserve">.</w:t>
+      </w:r>
+    </w:p>
+    <w:p>
+      <w:pPr>
+        <w:pStyle w:val="Heading2"/>
+        <w:keepNext w:val="0"/>
+        <w:keepLines w:val="0"/>
+        <w:spacing w:before="280" w:lineRule="auto"/>
+        <w:rPr/>
+      </w:pPr>
+      <w:bookmarkStart w:colFirst="0" w:colLast="0" w:name="_tr0ky9lpj57c" w:id="39"/>
+      <w:bookmarkEnd w:id="39"/>
+      <w:r>
+        <w:rPr>
+          <w:rtl w:val="0"/>
+        </w:rPr>
+        <w:t xml:space="preserve">VE-008</w:t>
+      </w:r>
+    </w:p>
+    <w:p>
+      <w:pPr>
+        <w:spacing w:after="240" w:before="240" w:lineRule="auto"/>
+        <w:ind w:left="600" w:right="600" w:firstLine="0"/>
+        <w:rPr/>
+      </w:pPr>
+      <w:r>
+        <w:rPr>
+          <w:rFonts w:ascii="Roboto Mono" w:cs="Roboto Mono" w:eastAsia="Roboto Mono" w:hAnsi="Roboto Mono"/>
+          <w:color w:val="188038"/>
+          <w:rtl w:val="0"/>
+        </w:rPr>
+        <w:t xml:space="preserve">position_transitions</w:t>
+      </w:r>
+      <w:r>
+        <w:rPr>
+          <w:rtl w:val="0"/>
+        </w:rPr>
+        <w:t xml:space="preserve"> deberá estar constituido exclusivamente por instancias válidas de </w:t>
+      </w:r>
+      <w:r>
+        <w:rPr>
+          <w:rFonts w:ascii="Roboto Mono" w:cs="Roboto Mono" w:eastAsia="Roboto Mono" w:hAnsi="Roboto Mono"/>
+          <w:color w:val="188038"/>
+          <w:rtl w:val="0"/>
+        </w:rPr>
+        <w:t xml:space="preserve">PortfolioPositionTransition</w:t>
+      </w:r>
+      <w:r>
+        <w:rPr>
+          <w:rtl w:val="0"/>
+        </w:rPr>
+        <w:t xml:space="preserve">.</w:t>
+      </w:r>
+    </w:p>
+    <w:p>
+      <w:pPr>
+        <w:pStyle w:val="Heading2"/>
+        <w:keepNext w:val="0"/>
+        <w:keepLines w:val="0"/>
+        <w:spacing w:before="280" w:lineRule="auto"/>
+        <w:rPr/>
+      </w:pPr>
+      <w:bookmarkStart w:colFirst="0" w:colLast="0" w:name="_xyfz3fvd4qc0" w:id="40"/>
+      <w:bookmarkEnd w:id="40"/>
+      <w:r>
+        <w:rPr>
+          <w:rtl w:val="0"/>
+        </w:rPr>
+        <w:t xml:space="preserve">VE-009</w:t>
+      </w:r>
+    </w:p>
+    <w:p>
+      <w:pPr>
+        <w:spacing w:after="240" w:before="240" w:lineRule="auto"/>
+        <w:ind w:left="600" w:right="600" w:firstLine="0"/>
+        <w:rPr/>
+      </w:pPr>
+      <w:r>
+        <w:rPr>
+          <w:rFonts w:ascii="Roboto Mono" w:cs="Roboto Mono" w:eastAsia="Roboto Mono" w:hAnsi="Roboto Mono"/>
+          <w:color w:val="188038"/>
+          <w:rtl w:val="0"/>
+        </w:rPr>
+        <w:t xml:space="preserve">monetary_transitions</w:t>
+      </w:r>
+      <w:r>
+        <w:rPr>
+          <w:rtl w:val="0"/>
+        </w:rPr>
+        <w:t xml:space="preserve"> deberá estar constituido exclusivamente por instancias válidas de </w:t>
+      </w:r>
+      <w:r>
+        <w:rPr>
+          <w:rFonts w:ascii="Roboto Mono" w:cs="Roboto Mono" w:eastAsia="Roboto Mono" w:hAnsi="Roboto Mono"/>
+          <w:color w:val="188038"/>
+          <w:rtl w:val="0"/>
+        </w:rPr>
+        <w:t xml:space="preserve">PortfolioMonetaryTransition</w:t>
+      </w:r>
+      <w:r>
+        <w:rPr>
+          <w:rtl w:val="0"/>
+        </w:rPr>
+        <w:t xml:space="preserve">.</w:t>
+      </w:r>
+    </w:p>
+    <w:p>
+      <w:pPr>
+        <w:pStyle w:val="Heading2"/>
+        <w:keepNext w:val="0"/>
+        <w:keepLines w:val="0"/>
+        <w:spacing w:before="280" w:lineRule="auto"/>
+        <w:rPr/>
+      </w:pPr>
+      <w:bookmarkStart w:colFirst="0" w:colLast="0" w:name="_uxokmg4bz1g5" w:id="41"/>
+      <w:bookmarkEnd w:id="41"/>
+      <w:r>
+        <w:rPr>
+          <w:rtl w:val="0"/>
+        </w:rPr>
+        <w:t xml:space="preserve">VE-010</w:t>
+      </w:r>
+    </w:p>
+    <w:p>
+      <w:pPr>
+        <w:spacing w:after="240" w:before="240" w:lineRule="auto"/>
+        <w:ind w:left="600" w:right="600" w:firstLine="0"/>
+        <w:rPr/>
+      </w:pPr>
+      <w:r>
+        <w:rPr>
+          <w:rtl w:val="0"/>
+        </w:rPr>
+        <w:t xml:space="preserve">Al menos una de las dos colecciones deberá contener una transformación material.</w:t>
+      </w:r>
+    </w:p>
+    <w:p>
+      <w:pPr>
+        <w:pStyle w:val="Heading2"/>
+        <w:keepNext w:val="0"/>
+        <w:keepLines w:val="0"/>
+        <w:spacing w:before="280" w:lineRule="auto"/>
+        <w:rPr/>
+      </w:pPr>
+      <w:bookmarkStart w:colFirst="0" w:colLast="0" w:name="_vfy35x91yhmi" w:id="42"/>
+      <w:bookmarkEnd w:id="42"/>
+      <w:r>
+        <w:rPr>
+          <w:rtl w:val="0"/>
+        </w:rPr>
+        <w:t xml:space="preserve">VE-011</w:t>
+      </w:r>
+    </w:p>
+    <w:p>
+      <w:pPr>
+        <w:spacing w:after="240" w:before="240" w:lineRule="auto"/>
+        <w:ind w:left="600" w:right="600" w:firstLine="0"/>
+        <w:rPr/>
+      </w:pPr>
+      <w:r>
+        <w:rPr>
+          <w:rtl w:val="0"/>
+        </w:rPr>
+        <w:t xml:space="preserve">Las colecciones deberán quedar canonicalizadas de forma determinista e independiente del orden accidental de construcción.</w:t>
+      </w:r>
+    </w:p>
+    <w:p>
+      <w:pPr>
+        <w:spacing w:after="240" w:before="240" w:lineRule="auto"/>
+        <w:rPr/>
+      </w:pPr>
+      <w:r>
+        <w:rPr>
+          <w:rtl w:val="0"/>
+        </w:rPr>
       </w:r>
     </w:p>
     <w:p>
@@ -4046,6 +4709,239 @@
         <w:rPr>
           <w:rtl w:val="0"/>
         </w:rPr>
+      </w:r>
+    </w:p>
+    <w:p>
+      <w:pPr>
+        <w:rPr/>
+      </w:pPr>
+      <w:r>
+        <w:rPr>
+          <w:rtl w:val="0"/>
+        </w:rPr>
+      </w:r>
+    </w:p>
+    <w:p>
+      <w:pPr>
+        <w:pStyle w:val="Heading2"/>
+        <w:keepNext w:val="0"/>
+        <w:keepLines w:val="0"/>
+        <w:spacing w:before="280" w:lineRule="auto"/>
+        <w:rPr/>
+      </w:pPr>
+      <w:bookmarkStart w:colFirst="0" w:colLast="0" w:name="_viu6vwrncgcn" w:id="43"/>
+      <w:bookmarkEnd w:id="43"/>
+      <w:r>
+        <w:rPr>
+          <w:rtl w:val="0"/>
+        </w:rPr>
+        <w:t xml:space="preserve">16 Excepciones Públicas</w:t>
+      </w:r>
+    </w:p>
+    <w:p>
+      <w:pPr>
+        <w:spacing w:after="240" w:before="240" w:lineRule="auto"/>
+        <w:ind w:left="600" w:right="600" w:firstLine="0"/>
+        <w:rPr/>
+      </w:pPr>
+      <w:r>
+        <w:rPr>
+          <w:rtl w:val="0"/>
+        </w:rPr>
+        <w:t xml:space="preserve">El incremento autoriza exclusivamente la siguiente jerarquía pública de excepciones:</w:t>
+      </w:r>
+    </w:p>
+    <w:p>
+      <w:pPr>
+        <w:spacing w:after="240" w:before="240" w:lineRule="auto"/>
+        <w:ind w:left="600" w:right="600" w:firstLine="0"/>
+        <w:rPr>
+          <w:rFonts w:ascii="Roboto Mono" w:cs="Roboto Mono" w:eastAsia="Roboto Mono" w:hAnsi="Roboto Mono"/>
+          <w:color w:val="188038"/>
+        </w:rPr>
+      </w:pPr>
+      <w:r>
+        <w:rPr>
+          <w:rFonts w:ascii="Roboto Mono" w:cs="Roboto Mono" w:eastAsia="Roboto Mono" w:hAnsi="Roboto Mono"/>
+          <w:color w:val="188038"/>
+          <w:rtl w:val="0"/>
+        </w:rPr>
+        <w:t xml:space="preserve">PortfolioTransitionError</w:t>
+      </w:r>
+    </w:p>
+    <w:p>
+      <w:pPr>
+        <w:spacing w:after="240" w:before="240" w:lineRule="auto"/>
+        <w:ind w:left="600" w:right="600" w:firstLine="0"/>
+        <w:rPr>
+          <w:rFonts w:ascii="Roboto Mono" w:cs="Roboto Mono" w:eastAsia="Roboto Mono" w:hAnsi="Roboto Mono"/>
+          <w:color w:val="188038"/>
+        </w:rPr>
+      </w:pPr>
+      <w:r>
+        <w:rPr>
+          <w:rtl w:val="0"/>
+        </w:rPr>
+        <w:t xml:space="preserve">├── </w:t>
+      </w:r>
+      <w:r>
+        <w:rPr>
+          <w:rFonts w:ascii="Roboto Mono" w:cs="Roboto Mono" w:eastAsia="Roboto Mono" w:hAnsi="Roboto Mono"/>
+          <w:color w:val="188038"/>
+          <w:rtl w:val="0"/>
+        </w:rPr>
+        <w:t xml:space="preserve">InvalidPortfolioTransitionComponentError</w:t>
+      </w:r>
+    </w:p>
+    <w:p>
+      <w:pPr>
+        <w:spacing w:after="240" w:before="240" w:lineRule="auto"/>
+        <w:ind w:left="600" w:right="600" w:firstLine="0"/>
+        <w:rPr>
+          <w:rFonts w:ascii="Roboto Mono" w:cs="Roboto Mono" w:eastAsia="Roboto Mono" w:hAnsi="Roboto Mono"/>
+          <w:color w:val="188038"/>
+        </w:rPr>
+      </w:pPr>
+      <w:r>
+        <w:rPr>
+          <w:rtl w:val="0"/>
+        </w:rPr>
+        <w:t xml:space="preserve">├── </w:t>
+      </w:r>
+      <w:r>
+        <w:rPr>
+          <w:rFonts w:ascii="Roboto Mono" w:cs="Roboto Mono" w:eastAsia="Roboto Mono" w:hAnsi="Roboto Mono"/>
+          <w:color w:val="188038"/>
+          <w:rtl w:val="0"/>
+        </w:rPr>
+        <w:t xml:space="preserve">DuplicatePortfolioTransitionComponentError</w:t>
+      </w:r>
+    </w:p>
+    <w:p>
+      <w:pPr>
+        <w:spacing w:after="240" w:before="240" w:lineRule="auto"/>
+        <w:ind w:left="600" w:right="600" w:firstLine="0"/>
+        <w:rPr>
+          <w:rFonts w:ascii="Roboto Mono" w:cs="Roboto Mono" w:eastAsia="Roboto Mono" w:hAnsi="Roboto Mono"/>
+          <w:color w:val="188038"/>
+        </w:rPr>
+      </w:pPr>
+      <w:r>
+        <w:rPr>
+          <w:rtl w:val="0"/>
+        </w:rPr>
+        <w:t xml:space="preserve">└── </w:t>
+      </w:r>
+      <w:r>
+        <w:rPr>
+          <w:rFonts w:ascii="Roboto Mono" w:cs="Roboto Mono" w:eastAsia="Roboto Mono" w:hAnsi="Roboto Mono"/>
+          <w:color w:val="188038"/>
+          <w:rtl w:val="0"/>
+        </w:rPr>
+        <w:t xml:space="preserve">InvalidPortfolioTransitionRelationError</w:t>
+      </w:r>
+    </w:p>
+    <w:p>
+      <w:pPr>
+        <w:spacing w:after="240" w:before="240" w:lineRule="auto"/>
+        <w:ind w:left="600" w:right="600" w:firstLine="0"/>
+        <w:rPr/>
+      </w:pPr>
+      <w:r>
+        <w:rPr>
+          <w:rtl w:val="0"/>
+        </w:rPr>
+        <w:t xml:space="preserve">Las tres excepciones específicas derivarán directamente de </w:t>
+      </w:r>
+      <w:r>
+        <w:rPr>
+          <w:rFonts w:ascii="Roboto Mono" w:cs="Roboto Mono" w:eastAsia="Roboto Mono" w:hAnsi="Roboto Mono"/>
+          <w:color w:val="188038"/>
+          <w:rtl w:val="0"/>
+        </w:rPr>
+        <w:t xml:space="preserve">PortfolioTransitionError</w:t>
+      </w:r>
+      <w:r>
+        <w:rPr>
+          <w:rtl w:val="0"/>
+        </w:rPr>
+        <w:t xml:space="preserve">.</w:t>
+      </w:r>
+    </w:p>
+    <w:p>
+      <w:pPr>
+        <w:spacing w:after="240" w:before="240" w:lineRule="auto"/>
+        <w:ind w:left="600" w:right="600" w:firstLine="0"/>
+        <w:rPr/>
+      </w:pPr>
+      <w:r>
+        <w:rPr>
+          <w:rFonts w:ascii="Roboto Mono" w:cs="Roboto Mono" w:eastAsia="Roboto Mono" w:hAnsi="Roboto Mono"/>
+          <w:color w:val="188038"/>
+          <w:rtl w:val="0"/>
+        </w:rPr>
+        <w:t xml:space="preserve">InvalidPortfolioTransitionComponentError</w:t>
+      </w:r>
+      <w:r>
+        <w:rPr>
+          <w:rtl w:val="0"/>
+        </w:rPr>
+        <w:t xml:space="preserve"> representará violaciones estructurales de los componentes constitutivos.</w:t>
+      </w:r>
+    </w:p>
+    <w:p>
+      <w:pPr>
+        <w:spacing w:after="240" w:before="240" w:lineRule="auto"/>
+        <w:ind w:left="600" w:right="600" w:firstLine="0"/>
+        <w:rPr/>
+      </w:pPr>
+      <w:r>
+        <w:rPr>
+          <w:rFonts w:ascii="Roboto Mono" w:cs="Roboto Mono" w:eastAsia="Roboto Mono" w:hAnsi="Roboto Mono"/>
+          <w:color w:val="188038"/>
+          <w:rtl w:val="0"/>
+        </w:rPr>
+        <w:t xml:space="preserve">DuplicatePortfolioTransitionComponentError</w:t>
+      </w:r>
+      <w:r>
+        <w:rPr>
+          <w:rtl w:val="0"/>
+        </w:rPr>
+        <w:t xml:space="preserve"> representará exclusivamente duplicidad de identidades públicas dentro de las colecciones de transformación.</w:t>
+      </w:r>
+    </w:p>
+    <w:p>
+      <w:pPr>
+        <w:spacing w:after="240" w:before="240" w:lineRule="auto"/>
+        <w:ind w:left="600" w:right="600" w:firstLine="0"/>
+        <w:rPr/>
+      </w:pPr>
+      <w:r>
+        <w:rPr>
+          <w:rFonts w:ascii="Roboto Mono" w:cs="Roboto Mono" w:eastAsia="Roboto Mono" w:hAnsi="Roboto Mono"/>
+          <w:color w:val="188038"/>
+          <w:rtl w:val="0"/>
+        </w:rPr>
+        <w:t xml:space="preserve">InvalidPortfolioTransitionRelationError</w:t>
+      </w:r>
+      <w:r>
+        <w:rPr>
+          <w:rtl w:val="0"/>
+        </w:rPr>
+        <w:t xml:space="preserve"> representará violaciones de la relación contractual entre Current Portfolio State, Target Portfolio State y la transformación declarada.</w:t>
+      </w:r>
+    </w:p>
+    <w:p>
+      <w:pPr>
+        <w:spacing w:after="240" w:before="240" w:lineRule="auto"/>
+        <w:ind w:left="600" w:right="600" w:firstLine="0"/>
+        <w:rPr/>
+      </w:pPr>
+      <w:r>
+        <w:rPr>
+          <w:rtl w:val="0"/>
+        </w:rPr>
+        <w:t xml:space="preserve">No se autorizan excepciones públicas adicionales en el presente incremento.</w:t>
       </w:r>
     </w:p>
     <w:p>
@@ -4061,8 +4957,8 @@
           <w:szCs w:val="46"/>
         </w:rPr>
       </w:pPr>
-      <w:bookmarkStart w:colFirst="0" w:colLast="0" w:name="_jy15a9ofxqi0" w:id="34"/>
-      <w:bookmarkEnd w:id="34"/>
+      <w:bookmarkStart w:colFirst="0" w:colLast="0" w:name="_bqikbkiwwwbq" w:id="44"/>
+      <w:bookmarkEnd w:id="44"/>
       <w:r>
         <w:rPr>
           <w:b w:val="1"/>
@@ -4071,154 +4967,178 @@
           <w:szCs w:val="46"/>
           <w:rtl w:val="0"/>
         </w:rPr>
-        <w:t xml:space="preserve">16. Compatibilidad del Modelo</w:t>
-      </w:r>
-    </w:p>
-    <w:p>
-      <w:pPr>
-        <w:spacing w:after="240" w:before="240" w:lineRule="auto"/>
-        <w:rPr/>
-      </w:pPr>
-      <w:r>
-        <w:rPr>
-          <w:rtl w:val="0"/>
-        </w:rPr>
-        <w:t xml:space="preserve">La implementación deberá preservar completamente la compatibilidad arquitectónica con:</w:t>
-      </w:r>
-    </w:p>
-    <w:p>
-      <w:pPr>
-        <w:numPr>
-          <w:ilvl w:val="0"/>
-          <w:numId w:val="7"/>
-        </w:numPr>
-        <w:spacing w:after="0" w:afterAutospacing="0" w:before="240" w:lineRule="auto"/>
-        <w:ind w:left="720" w:hanging="360"/>
-      </w:pPr>
-      <w:r>
-        <w:rPr>
-          <w:rtl w:val="0"/>
-        </w:rPr>
-        <w:t xml:space="preserve">DOC-033;</w:t>
-      </w:r>
-    </w:p>
-    <w:p>
-      <w:pPr>
-        <w:numPr>
-          <w:ilvl w:val="0"/>
-          <w:numId w:val="7"/>
-        </w:numPr>
-        <w:spacing w:after="0" w:afterAutospacing="0" w:before="0" w:beforeAutospacing="0" w:lineRule="auto"/>
-        <w:ind w:left="720" w:hanging="360"/>
-      </w:pPr>
-      <w:r>
-        <w:rPr>
-          <w:rtl w:val="0"/>
-        </w:rPr>
-        <w:t xml:space="preserve">PortfolioState;</w:t>
-      </w:r>
-    </w:p>
-    <w:p>
-      <w:pPr>
-        <w:numPr>
-          <w:ilvl w:val="0"/>
-          <w:numId w:val="7"/>
-        </w:numPr>
-        <w:spacing w:after="0" w:afterAutospacing="0" w:before="0" w:beforeAutospacing="0" w:lineRule="auto"/>
-        <w:ind w:left="720" w:hanging="360"/>
-      </w:pPr>
-      <w:r>
-        <w:rPr>
-          <w:rtl w:val="0"/>
-        </w:rPr>
-        <w:t xml:space="preserve">InstrumentReference;</w:t>
-      </w:r>
-    </w:p>
-    <w:p>
-      <w:pPr>
-        <w:numPr>
-          <w:ilvl w:val="0"/>
-          <w:numId w:val="7"/>
-        </w:numPr>
-        <w:spacing w:after="240" w:before="0" w:beforeAutospacing="0" w:lineRule="auto"/>
-        <w:ind w:left="720" w:hanging="360"/>
-      </w:pPr>
-      <w:r>
-        <w:rPr>
-          <w:rtl w:val="0"/>
-        </w:rPr>
-        <w:t xml:space="preserve">CurrencyReference.</w:t>
-      </w:r>
-    </w:p>
-    <w:p>
-      <w:pPr>
-        <w:spacing w:after="240" w:before="240" w:lineRule="auto"/>
-        <w:ind w:left="720" w:firstLine="0"/>
-        <w:rPr/>
-      </w:pPr>
-      <w:r>
-        <w:rPr>
-          <w:rtl w:val="0"/>
-        </w:rPr>
-      </w:r>
-    </w:p>
-    <w:p>
-      <w:pPr>
-        <w:spacing w:after="240" w:before="240" w:lineRule="auto"/>
-        <w:rPr/>
-      </w:pPr>
-      <w:r>
-        <w:rPr>
-          <w:rtl w:val="0"/>
-        </w:rPr>
-        <w:t xml:space="preserve">La implementación reutilizará directamente dichos contratos públicos.</w:t>
-      </w:r>
-    </w:p>
-    <w:p>
-      <w:pPr>
-        <w:spacing w:after="240" w:before="240" w:lineRule="auto"/>
-        <w:rPr/>
-      </w:pPr>
-      <w:r>
-        <w:rPr>
-          <w:rtl w:val="0"/>
-        </w:rPr>
-        <w:t xml:space="preserve">No se autorizan wrappers, adaptadores ni representaciones alternativas.</w:t>
-      </w:r>
-    </w:p>
-    <w:p>
-      <w:pPr>
-        <w:spacing w:after="240" w:before="240" w:lineRule="auto"/>
-        <w:rPr/>
-      </w:pPr>
-      <w:r>
-        <w:rPr>
-          <w:rtl w:val="0"/>
-        </w:rPr>
-        <w:t xml:space="preserve">No podrá introducir dependencias adicionales.</w:t>
-      </w:r>
-    </w:p>
-    <w:p>
-      <w:pPr>
-        <w:spacing w:after="240" w:before="240" w:lineRule="auto"/>
-        <w:rPr/>
-      </w:pPr>
-      <w:r>
-        <w:rPr>
-          <w:rtl w:val="0"/>
-        </w:rPr>
-        <w:t xml:space="preserve">No podrá modificar contratos públicos existentes.</w:t>
-      </w:r>
-    </w:p>
-    <w:p>
-      <w:pPr>
-        <w:rPr/>
-      </w:pPr>
-      <w:r>
-        <w:pict>
-          <v:rect style="width:0.0pt;height:1.5pt" o:hr="t" o:hrstd="t" o:hralign="center" fillcolor="#A0A0A0" stroked="f"/>
-        </w:pict>
-      </w:r>
+        <w:t xml:space="preserve">Exportación pública exacta</w:t>
+      </w:r>
+    </w:p>
+    <w:p>
+      <w:pPr>
+        <w:spacing w:after="240" w:before="240" w:lineRule="auto"/>
+        <w:rPr/>
+      </w:pPr>
+      <w:r>
+        <w:rPr>
+          <w:rtl w:val="0"/>
+        </w:rPr>
+        <w:t xml:space="preserve">La API pública autorizada es:</w:t>
+      </w:r>
+    </w:p>
+    <w:p>
+      <w:pPr>
+        <w:rPr/>
+      </w:pPr>
+      <w:r>
+        <w:rPr>
+          <w:rtl w:val="0"/>
+        </w:rPr>
+        <w:t xml:space="preserve">PortfolioTransition</w:t>
+      </w:r>
+    </w:p>
+    <w:p>
+      <w:pPr>
+        <w:rPr/>
+      </w:pPr>
+      <w:r>
+        <w:rPr>
+          <w:rtl w:val="0"/>
+        </w:rPr>
+        <w:t xml:space="preserve">PortfolioPositionTransition</w:t>
+      </w:r>
+    </w:p>
+    <w:p>
+      <w:pPr>
+        <w:rPr/>
+      </w:pPr>
+      <w:r>
+        <w:rPr>
+          <w:rtl w:val="0"/>
+        </w:rPr>
+        <w:t xml:space="preserve">PortfolioMonetaryTransition</w:t>
+      </w:r>
+    </w:p>
+    <w:p>
+      <w:pPr>
+        <w:rPr/>
+      </w:pPr>
+      <w:r>
+        <w:rPr>
+          <w:rtl w:val="0"/>
+        </w:rPr>
+        <w:t xml:space="preserve">PortfolioTransitionError</w:t>
+      </w:r>
+    </w:p>
+    <w:p>
+      <w:pPr>
+        <w:rPr/>
+      </w:pPr>
+      <w:r>
+        <w:rPr>
+          <w:rtl w:val="0"/>
+        </w:rPr>
+        <w:t xml:space="preserve">InvalidPortfolioTransitionComponentError</w:t>
+      </w:r>
+    </w:p>
+    <w:p>
+      <w:pPr>
+        <w:rPr/>
+      </w:pPr>
+      <w:r>
+        <w:rPr>
+          <w:rtl w:val="0"/>
+        </w:rPr>
+        <w:t xml:space="preserve">DuplicatePortfolioTransitionComponentError</w:t>
+      </w:r>
+    </w:p>
+    <w:p>
+      <w:pPr>
+        <w:rPr/>
+      </w:pPr>
+      <w:r>
+        <w:rPr>
+          <w:rtl w:val="0"/>
+        </w:rPr>
+        <w:t xml:space="preserve">InvalidPortfolioTransitionRelationError</w:t>
+      </w:r>
+    </w:p>
+    <w:p>
+      <w:pPr>
+        <w:rPr/>
+      </w:pPr>
+      <w:r>
+        <w:rPr>
+          <w:rtl w:val="0"/>
+        </w:rPr>
+      </w:r>
+    </w:p>
+    <w:p>
+      <w:pPr>
+        <w:spacing w:after="240" w:before="240" w:lineRule="auto"/>
+        <w:rPr/>
+      </w:pPr>
+      <w:r>
+        <w:rPr>
+          <w:rFonts w:ascii="Roboto Mono" w:cs="Roboto Mono" w:eastAsia="Roboto Mono" w:hAnsi="Roboto Mono"/>
+          <w:color w:val="188038"/>
+          <w:rtl w:val="0"/>
+        </w:rPr>
+        <w:t xml:space="preserve">PortfolioTransition</w:t>
+      </w:r>
+      <w:r>
+        <w:rPr>
+          <w:rtl w:val="0"/>
+        </w:rPr>
+        <w:t xml:space="preserve"> continúa siendo el único contrato público de salida de la Capability.</w:t>
+      </w:r>
+    </w:p>
+    <w:p>
+      <w:pPr>
+        <w:spacing w:after="240" w:before="240" w:lineRule="auto"/>
+        <w:rPr/>
+      </w:pPr>
+      <w:r>
+        <w:rPr>
+          <w:rFonts w:ascii="Roboto Mono" w:cs="Roboto Mono" w:eastAsia="Roboto Mono" w:hAnsi="Roboto Mono"/>
+          <w:color w:val="188038"/>
+          <w:rtl w:val="0"/>
+        </w:rPr>
+        <w:t xml:space="preserve">PortfolioPositionTransition</w:t>
+      </w:r>
+      <w:r>
+        <w:rPr>
+          <w:rtl w:val="0"/>
+        </w:rPr>
+        <w:t xml:space="preserve"> y </w:t>
+      </w:r>
+      <w:r>
+        <w:rPr>
+          <w:rFonts w:ascii="Roboto Mono" w:cs="Roboto Mono" w:eastAsia="Roboto Mono" w:hAnsi="Roboto Mono"/>
+          <w:color w:val="188038"/>
+          <w:rtl w:val="0"/>
+        </w:rPr>
+        <w:t xml:space="preserve">PortfolioMonetaryTransition</w:t>
+      </w:r>
+      <w:r>
+        <w:rPr>
+          <w:rtl w:val="0"/>
+        </w:rPr>
+        <w:t xml:space="preserve"> son valores públicos constitutivos de dicho contrato.</w:t>
+      </w:r>
+    </w:p>
+    <w:p>
+      <w:pPr>
+        <w:spacing w:after="240" w:before="240" w:lineRule="auto"/>
+        <w:rPr/>
+      </w:pPr>
+      <w:r>
+        <w:rPr>
+          <w:rtl w:val="0"/>
+        </w:rPr>
+        <w:t xml:space="preserve">Las excepciones forman parte de la API pública estructural y no constituyen activos de dominio ni contratos públicos de salida.</w:t>
+      </w:r>
+    </w:p>
+    <w:p>
+      <w:pPr>
+        <w:rPr/>
+      </w:pPr>
       <w:r>
         <w:rPr>
           <w:rtl w:val="0"/>
@@ -4238,8 +5158,8 @@
           <w:szCs w:val="46"/>
         </w:rPr>
       </w:pPr>
-      <w:bookmarkStart w:colFirst="0" w:colLast="0" w:name="_9esw071v0s7b" w:id="35"/>
-      <w:bookmarkEnd w:id="35"/>
+      <w:bookmarkStart w:colFirst="0" w:colLast="0" w:name="_jy15a9ofxqi0" w:id="45"/>
+      <w:bookmarkEnd w:id="45"/>
       <w:r>
         <w:rPr>
           <w:b w:val="1"/>
@@ -4248,7 +5168,184 @@
           <w:szCs w:val="46"/>
           <w:rtl w:val="0"/>
         </w:rPr>
-        <w:t xml:space="preserve">17. Estrategia de Pruebas</w:t>
+        <w:t xml:space="preserve">17. Compatibilidad del Modelo</w:t>
+      </w:r>
+    </w:p>
+    <w:p>
+      <w:pPr>
+        <w:spacing w:after="240" w:before="240" w:lineRule="auto"/>
+        <w:rPr/>
+      </w:pPr>
+      <w:r>
+        <w:rPr>
+          <w:rtl w:val="0"/>
+        </w:rPr>
+        <w:t xml:space="preserve">La implementación deberá preservar completamente la compatibilidad arquitectónica con:</w:t>
+      </w:r>
+    </w:p>
+    <w:p>
+      <w:pPr>
+        <w:numPr>
+          <w:ilvl w:val="0"/>
+          <w:numId w:val="8"/>
+        </w:numPr>
+        <w:spacing w:after="0" w:afterAutospacing="0" w:before="240" w:lineRule="auto"/>
+        <w:ind w:left="720" w:hanging="360"/>
+      </w:pPr>
+      <w:r>
+        <w:rPr>
+          <w:rtl w:val="0"/>
+        </w:rPr>
+        <w:t xml:space="preserve">DOC-033;</w:t>
+      </w:r>
+    </w:p>
+    <w:p>
+      <w:pPr>
+        <w:numPr>
+          <w:ilvl w:val="0"/>
+          <w:numId w:val="8"/>
+        </w:numPr>
+        <w:spacing w:after="0" w:afterAutospacing="0" w:before="0" w:beforeAutospacing="0" w:lineRule="auto"/>
+        <w:ind w:left="720" w:hanging="360"/>
+      </w:pPr>
+      <w:r>
+        <w:rPr>
+          <w:rtl w:val="0"/>
+        </w:rPr>
+        <w:t xml:space="preserve">PortfolioState;</w:t>
+      </w:r>
+    </w:p>
+    <w:p>
+      <w:pPr>
+        <w:numPr>
+          <w:ilvl w:val="0"/>
+          <w:numId w:val="8"/>
+        </w:numPr>
+        <w:spacing w:after="0" w:afterAutospacing="0" w:before="0" w:beforeAutospacing="0" w:lineRule="auto"/>
+        <w:ind w:left="720" w:hanging="360"/>
+      </w:pPr>
+      <w:r>
+        <w:rPr>
+          <w:rtl w:val="0"/>
+        </w:rPr>
+        <w:t xml:space="preserve">InstrumentReference;</w:t>
+      </w:r>
+    </w:p>
+    <w:p>
+      <w:pPr>
+        <w:numPr>
+          <w:ilvl w:val="0"/>
+          <w:numId w:val="8"/>
+        </w:numPr>
+        <w:spacing w:after="240" w:before="0" w:beforeAutospacing="0" w:lineRule="auto"/>
+        <w:ind w:left="720" w:hanging="360"/>
+      </w:pPr>
+      <w:r>
+        <w:rPr>
+          <w:rtl w:val="0"/>
+        </w:rPr>
+        <w:t xml:space="preserve">CurrencyReference.</w:t>
+      </w:r>
+    </w:p>
+    <w:p>
+      <w:pPr>
+        <w:spacing w:after="240" w:before="240" w:lineRule="auto"/>
+        <w:ind w:left="720" w:firstLine="0"/>
+        <w:rPr/>
+      </w:pPr>
+      <w:r>
+        <w:rPr>
+          <w:rtl w:val="0"/>
+        </w:rPr>
+      </w:r>
+    </w:p>
+    <w:p>
+      <w:pPr>
+        <w:spacing w:after="240" w:before="240" w:lineRule="auto"/>
+        <w:rPr/>
+      </w:pPr>
+      <w:r>
+        <w:rPr>
+          <w:rtl w:val="0"/>
+        </w:rPr>
+        <w:t xml:space="preserve">La implementación reutilizará directamente dichos contratos públicos.</w:t>
+      </w:r>
+    </w:p>
+    <w:p>
+      <w:pPr>
+        <w:spacing w:after="240" w:before="240" w:lineRule="auto"/>
+        <w:rPr/>
+      </w:pPr>
+      <w:r>
+        <w:rPr>
+          <w:rtl w:val="0"/>
+        </w:rPr>
+        <w:t xml:space="preserve">No se autorizan wrappers, adaptadores ni representaciones alternativas.</w:t>
+      </w:r>
+    </w:p>
+    <w:p>
+      <w:pPr>
+        <w:spacing w:after="240" w:before="240" w:lineRule="auto"/>
+        <w:rPr/>
+      </w:pPr>
+      <w:r>
+        <w:rPr>
+          <w:rtl w:val="0"/>
+        </w:rPr>
+        <w:t xml:space="preserve">No podrá introducir dependencias adicionales.</w:t>
+      </w:r>
+    </w:p>
+    <w:p>
+      <w:pPr>
+        <w:spacing w:after="240" w:before="240" w:lineRule="auto"/>
+        <w:rPr/>
+      </w:pPr>
+      <w:r>
+        <w:rPr>
+          <w:rtl w:val="0"/>
+        </w:rPr>
+        <w:t xml:space="preserve">No podrá modificar contratos públicos existentes.</w:t>
+      </w:r>
+    </w:p>
+    <w:p>
+      <w:pPr>
+        <w:rPr/>
+      </w:pPr>
+      <w:r>
+        <w:pict>
+          <v:rect style="width:0.0pt;height:1.5pt" o:hr="t" o:hrstd="t" o:hralign="center" fillcolor="#A0A0A0" stroked="f"/>
+        </w:pict>
+      </w:r>
+      <w:r>
+        <w:rPr>
+          <w:rtl w:val="0"/>
+        </w:rPr>
+      </w:r>
+    </w:p>
+    <w:p>
+      <w:pPr>
+        <w:pStyle w:val="Heading1"/>
+        <w:keepNext w:val="0"/>
+        <w:keepLines w:val="0"/>
+        <w:spacing w:before="480" w:lineRule="auto"/>
+        <w:rPr>
+          <w:b w:val="1"/>
+          <w:bCs w:val="1"/>
+          <w:sz w:val="46"/>
+          <w:szCs w:val="46"/>
+        </w:rPr>
+      </w:pPr>
+      <w:bookmarkStart w:colFirst="0" w:colLast="0" w:name="_9esw071v0s7b" w:id="46"/>
+      <w:bookmarkEnd w:id="46"/>
+      <w:r>
+        <w:rPr>
+          <w:b w:val="1"/>
+          <w:bCs w:val="1"/>
+          <w:sz w:val="46"/>
+          <w:szCs w:val="46"/>
+          <w:rtl w:val="0"/>
+        </w:rPr>
+        <w:t xml:space="preserve">18. Estrategia de Pruebas</w:t>
       </w:r>
     </w:p>
     <w:p>
@@ -4291,8 +5388,8 @@
           <w:szCs w:val="34"/>
         </w:rPr>
       </w:pPr>
-      <w:bookmarkStart w:colFirst="0" w:colLast="0" w:name="_2f02mxjryijx" w:id="36"/>
-      <w:bookmarkEnd w:id="36"/>
+      <w:bookmarkStart w:colFirst="0" w:colLast="0" w:name="_2f02mxjryijx" w:id="47"/>
+      <w:bookmarkEnd w:id="47"/>
       <w:r>
         <w:rPr>
           <w:b w:val="1"/>
@@ -4344,8 +5441,8 @@
           <w:szCs w:val="34"/>
         </w:rPr>
       </w:pPr>
-      <w:bookmarkStart w:colFirst="0" w:colLast="0" w:name="_7otc5cngvq9w" w:id="37"/>
-      <w:bookmarkEnd w:id="37"/>
+      <w:bookmarkStart w:colFirst="0" w:colLast="0" w:name="_7otc5cngvq9w" w:id="48"/>
+      <w:bookmarkEnd w:id="48"/>
       <w:r>
         <w:rPr>
           <w:b w:val="1"/>
@@ -4397,8 +5494,8 @@
           <w:szCs w:val="34"/>
         </w:rPr>
       </w:pPr>
-      <w:bookmarkStart w:colFirst="0" w:colLast="0" w:name="_ytnhfyimtunl" w:id="38"/>
-      <w:bookmarkEnd w:id="38"/>
+      <w:bookmarkStart w:colFirst="0" w:colLast="0" w:name="_ytnhfyimtunl" w:id="49"/>
+      <w:bookmarkEnd w:id="49"/>
       <w:r>
         <w:rPr>
           <w:b w:val="1"/>
@@ -4450,8 +5547,8 @@
           <w:szCs w:val="34"/>
         </w:rPr>
       </w:pPr>
-      <w:bookmarkStart w:colFirst="0" w:colLast="0" w:name="_1v8hnp5jajjj" w:id="39"/>
-      <w:bookmarkEnd w:id="39"/>
+      <w:bookmarkStart w:colFirst="0" w:colLast="0" w:name="_1v8hnp5jajjj" w:id="50"/>
+      <w:bookmarkEnd w:id="50"/>
       <w:r>
         <w:rPr>
           <w:b w:val="1"/>
@@ -4517,8 +5614,8 @@
           <w:szCs w:val="34"/>
         </w:rPr>
       </w:pPr>
-      <w:bookmarkStart w:colFirst="0" w:colLast="0" w:name="_xrmek3jgucz8" w:id="40"/>
-      <w:bookmarkEnd w:id="40"/>
+      <w:bookmarkStart w:colFirst="0" w:colLast="0" w:name="_xrmek3jgucz8" w:id="51"/>
+      <w:bookmarkEnd w:id="51"/>
       <w:r>
         <w:rPr>
           <w:b w:val="1"/>
@@ -4570,8 +5667,8 @@
           <w:szCs w:val="34"/>
         </w:rPr>
       </w:pPr>
-      <w:bookmarkStart w:colFirst="0" w:colLast="0" w:name="_y0cjkn1hj2po" w:id="41"/>
-      <w:bookmarkEnd w:id="41"/>
+      <w:bookmarkStart w:colFirst="0" w:colLast="0" w:name="_y0cjkn1hj2po" w:id="52"/>
+      <w:bookmarkEnd w:id="52"/>
       <w:r>
         <w:rPr>
           <w:b w:val="1"/>
@@ -4623,8 +5720,8 @@
           <w:szCs w:val="34"/>
         </w:rPr>
       </w:pPr>
-      <w:bookmarkStart w:colFirst="0" w:colLast="0" w:name="_hker3lzf3wc8" w:id="42"/>
-      <w:bookmarkEnd w:id="42"/>
+      <w:bookmarkStart w:colFirst="0" w:colLast="0" w:name="_hker3lzf3wc8" w:id="53"/>
+      <w:bookmarkEnd w:id="53"/>
       <w:r>
         <w:rPr>
           <w:b w:val="1"/>
@@ -4676,8 +5773,8 @@
           <w:szCs w:val="34"/>
         </w:rPr>
       </w:pPr>
-      <w:bookmarkStart w:colFirst="0" w:colLast="0" w:name="_r0jvmsuk4kim" w:id="43"/>
-      <w:bookmarkEnd w:id="43"/>
+      <w:bookmarkStart w:colFirst="0" w:colLast="0" w:name="_r0jvmsuk4kim" w:id="54"/>
+      <w:bookmarkEnd w:id="54"/>
       <w:r>
         <w:rPr>
           <w:b w:val="1"/>
@@ -4705,7 +5802,7 @@
       <w:pPr>
         <w:numPr>
           <w:ilvl w:val="0"/>
-          <w:numId w:val="18"/>
+          <w:numId w:val="19"/>
         </w:numPr>
         <w:spacing w:after="0" w:afterAutospacing="0" w:before="240" w:lineRule="auto"/>
         <w:ind w:left="720" w:hanging="360"/>
@@ -4721,7 +5818,7 @@
       <w:pPr>
         <w:numPr>
           <w:ilvl w:val="0"/>
-          <w:numId w:val="18"/>
+          <w:numId w:val="19"/>
         </w:numPr>
         <w:spacing w:after="240" w:before="0" w:beforeAutospacing="0" w:lineRule="auto"/>
         <w:ind w:left="720" w:hanging="360"/>
@@ -4761,8 +5858,8 @@
           <w:szCs w:val="34"/>
         </w:rPr>
       </w:pPr>
-      <w:bookmarkStart w:colFirst="0" w:colLast="0" w:name="_1qb7sj4cc647" w:id="44"/>
-      <w:bookmarkEnd w:id="44"/>
+      <w:bookmarkStart w:colFirst="0" w:colLast="0" w:name="_1qb7sj4cc647" w:id="55"/>
+      <w:bookmarkEnd w:id="55"/>
       <w:r>
         <w:rPr>
           <w:b w:val="1"/>
@@ -4790,7 +5887,7 @@
       <w:pPr>
         <w:numPr>
           <w:ilvl w:val="0"/>
-          <w:numId w:val="12"/>
+          <w:numId w:val="13"/>
         </w:numPr>
         <w:spacing w:after="0" w:afterAutospacing="0" w:before="240" w:lineRule="auto"/>
         <w:ind w:left="720" w:hanging="360"/>
@@ -4806,7 +5903,7 @@
       <w:pPr>
         <w:numPr>
           <w:ilvl w:val="0"/>
-          <w:numId w:val="12"/>
+          <w:numId w:val="13"/>
         </w:numPr>
         <w:spacing w:after="0" w:afterAutospacing="0" w:before="0" w:beforeAutospacing="0" w:lineRule="auto"/>
         <w:ind w:left="720" w:hanging="360"/>
@@ -4836,7 +5933,7 @@
       <w:pPr>
         <w:numPr>
           <w:ilvl w:val="0"/>
-          <w:numId w:val="12"/>
+          <w:numId w:val="13"/>
         </w:numPr>
         <w:spacing w:after="0" w:afterAutospacing="0" w:before="0" w:beforeAutospacing="0" w:lineRule="auto"/>
         <w:ind w:left="720" w:hanging="360"/>
@@ -4866,7 +5963,7 @@
       <w:pPr>
         <w:numPr>
           <w:ilvl w:val="0"/>
-          <w:numId w:val="12"/>
+          <w:numId w:val="13"/>
         </w:numPr>
         <w:spacing w:after="240" w:before="0" w:beforeAutospacing="0" w:lineRule="auto"/>
         <w:ind w:left="720" w:hanging="360"/>
@@ -4891,8 +5988,8 @@
           <w:szCs w:val="34"/>
         </w:rPr>
       </w:pPr>
-      <w:bookmarkStart w:colFirst="0" w:colLast="0" w:name="_uisqfp819uko" w:id="45"/>
-      <w:bookmarkEnd w:id="45"/>
+      <w:bookmarkStart w:colFirst="0" w:colLast="0" w:name="_uisqfp819uko" w:id="56"/>
+      <w:bookmarkEnd w:id="56"/>
       <w:r>
         <w:rPr>
           <w:b w:val="1"/>
@@ -4945,8 +6042,8 @@
           <w:szCs w:val="34"/>
         </w:rPr>
       </w:pPr>
-      <w:bookmarkStart w:colFirst="0" w:colLast="0" w:name="_stap6ru1nhw" w:id="46"/>
-      <w:bookmarkEnd w:id="46"/>
+      <w:bookmarkStart w:colFirst="0" w:colLast="0" w:name="_stap6ru1nhw" w:id="57"/>
+      <w:bookmarkEnd w:id="57"/>
       <w:r>
         <w:rPr>
           <w:b w:val="1"/>
@@ -4972,13 +6069,237 @@
     </w:p>
     <w:p>
       <w:pPr>
-        <w:spacing w:after="240" w:before="240" w:lineRule="auto"/>
-        <w:rPr/>
-      </w:pPr>
-      <w:r>
-        <w:rPr>
-          <w:rtl w:val="0"/>
-        </w:rPr>
+        <w:pStyle w:val="Heading2"/>
+        <w:spacing w:after="240" w:before="240" w:lineRule="auto"/>
+        <w:rPr/>
+      </w:pPr>
+      <w:bookmarkStart w:colFirst="0" w:colLast="0" w:name="_63gjbkee13wz" w:id="58"/>
+      <w:bookmarkEnd w:id="58"/>
+      <w:r>
+        <w:rPr>
+          <w:rtl w:val="0"/>
+        </w:rPr>
+        <w:t xml:space="preserve">18.1 Pruebas adicionales </w:t>
+      </w:r>
+    </w:p>
+    <w:p>
+      <w:pPr>
+        <w:spacing w:after="240" w:before="240" w:lineRule="auto"/>
+        <w:rPr/>
+      </w:pPr>
+      <w:r>
+        <w:rPr>
+          <w:rtl w:val="0"/>
+        </w:rPr>
+        <w:t xml:space="preserve">En la estrategia de pruebas deben aparecer explícitamente:</w:t>
+      </w:r>
+    </w:p>
+    <w:p>
+      <w:pPr>
+        <w:numPr>
+          <w:ilvl w:val="0"/>
+          <w:numId w:val="5"/>
+        </w:numPr>
+        <w:spacing w:after="0" w:afterAutospacing="0" w:before="240" w:lineRule="auto"/>
+        <w:ind w:left="720" w:hanging="360"/>
+      </w:pPr>
+      <w:r>
+        <w:rPr>
+          <w:rtl w:val="0"/>
+        </w:rPr>
+        <w:t xml:space="preserve">Current requerido;</w:t>
+      </w:r>
+    </w:p>
+    <w:p>
+      <w:pPr>
+        <w:numPr>
+          <w:ilvl w:val="0"/>
+          <w:numId w:val="5"/>
+        </w:numPr>
+        <w:spacing w:after="0" w:afterAutospacing="0" w:before="0" w:beforeAutospacing="0" w:lineRule="auto"/>
+        <w:ind w:left="720" w:hanging="360"/>
+      </w:pPr>
+      <w:r>
+        <w:rPr>
+          <w:rtl w:val="0"/>
+        </w:rPr>
+        <w:t xml:space="preserve">Target requerido;</w:t>
+      </w:r>
+    </w:p>
+    <w:p>
+      <w:pPr>
+        <w:numPr>
+          <w:ilvl w:val="0"/>
+          <w:numId w:val="5"/>
+        </w:numPr>
+        <w:spacing w:after="0" w:afterAutospacing="0" w:before="0" w:beforeAutospacing="0" w:lineRule="auto"/>
+        <w:ind w:left="720" w:hanging="360"/>
+      </w:pPr>
+      <w:r>
+        <w:rPr>
+          <w:rtl w:val="0"/>
+        </w:rPr>
+        <w:t xml:space="preserve">tipo inválido para Current;</w:t>
+      </w:r>
+    </w:p>
+    <w:p>
+      <w:pPr>
+        <w:numPr>
+          <w:ilvl w:val="0"/>
+          <w:numId w:val="5"/>
+        </w:numPr>
+        <w:spacing w:after="0" w:afterAutospacing="0" w:before="0" w:beforeAutospacing="0" w:lineRule="auto"/>
+        <w:ind w:left="720" w:hanging="360"/>
+      </w:pPr>
+      <w:r>
+        <w:rPr>
+          <w:rtl w:val="0"/>
+        </w:rPr>
+        <w:t xml:space="preserve">tipo inválido para Target;</w:t>
+      </w:r>
+    </w:p>
+    <w:p>
+      <w:pPr>
+        <w:numPr>
+          <w:ilvl w:val="0"/>
+          <w:numId w:val="5"/>
+        </w:numPr>
+        <w:spacing w:after="0" w:afterAutospacing="0" w:before="0" w:beforeAutospacing="0" w:lineRule="auto"/>
+        <w:ind w:left="720" w:hanging="360"/>
+      </w:pPr>
+      <w:r>
+        <w:rPr>
+          <w:rtl w:val="0"/>
+        </w:rPr>
+        <w:t xml:space="preserve">solo posiciones;</w:t>
+      </w:r>
+    </w:p>
+    <w:p>
+      <w:pPr>
+        <w:numPr>
+          <w:ilvl w:val="0"/>
+          <w:numId w:val="5"/>
+        </w:numPr>
+        <w:spacing w:after="0" w:afterAutospacing="0" w:before="0" w:beforeAutospacing="0" w:lineRule="auto"/>
+        <w:ind w:left="720" w:hanging="360"/>
+      </w:pPr>
+      <w:r>
+        <w:rPr>
+          <w:rtl w:val="0"/>
+        </w:rPr>
+        <w:t xml:space="preserve">solo moneda;</w:t>
+      </w:r>
+    </w:p>
+    <w:p>
+      <w:pPr>
+        <w:numPr>
+          <w:ilvl w:val="0"/>
+          <w:numId w:val="5"/>
+        </w:numPr>
+        <w:spacing w:after="0" w:afterAutospacing="0" w:before="0" w:beforeAutospacing="0" w:lineRule="auto"/>
+        <w:ind w:left="720" w:hanging="360"/>
+      </w:pPr>
+      <w:r>
+        <w:rPr>
+          <w:rtl w:val="0"/>
+        </w:rPr>
+        <w:t xml:space="preserve">ambas colecciones;</w:t>
+      </w:r>
+    </w:p>
+    <w:p>
+      <w:pPr>
+        <w:numPr>
+          <w:ilvl w:val="0"/>
+          <w:numId w:val="5"/>
+        </w:numPr>
+        <w:spacing w:after="0" w:afterAutospacing="0" w:before="0" w:beforeAutospacing="0" w:lineRule="auto"/>
+        <w:ind w:left="720" w:hanging="360"/>
+      </w:pPr>
+      <w:r>
+        <w:rPr>
+          <w:rtl w:val="0"/>
+        </w:rPr>
+        <w:t xml:space="preserve">ambas colecciones vacías;</w:t>
+      </w:r>
+    </w:p>
+    <w:p>
+      <w:pPr>
+        <w:numPr>
+          <w:ilvl w:val="0"/>
+          <w:numId w:val="5"/>
+        </w:numPr>
+        <w:spacing w:after="0" w:afterAutospacing="0" w:before="0" w:beforeAutospacing="0" w:lineRule="auto"/>
+        <w:ind w:left="720" w:hanging="360"/>
+      </w:pPr>
+      <w:r>
+        <w:rPr>
+          <w:rtl w:val="0"/>
+        </w:rPr>
+        <w:t xml:space="preserve">tipos inválidos dentro de cada colección;</w:t>
+      </w:r>
+    </w:p>
+    <w:p>
+      <w:pPr>
+        <w:numPr>
+          <w:ilvl w:val="0"/>
+          <w:numId w:val="5"/>
+        </w:numPr>
+        <w:spacing w:after="0" w:afterAutospacing="0" w:before="0" w:beforeAutospacing="0" w:lineRule="auto"/>
+        <w:ind w:left="720" w:hanging="360"/>
+      </w:pPr>
+      <w:r>
+        <w:rPr>
+          <w:rtl w:val="0"/>
+        </w:rPr>
+        <w:t xml:space="preserve">canonicalización independientemente del orden;</w:t>
+      </w:r>
+    </w:p>
+    <w:p>
+      <w:pPr>
+        <w:numPr>
+          <w:ilvl w:val="0"/>
+          <w:numId w:val="5"/>
+        </w:numPr>
+        <w:spacing w:after="0" w:afterAutospacing="0" w:before="0" w:beforeAutospacing="0" w:lineRule="auto"/>
+        <w:ind w:left="720" w:hanging="360"/>
+      </w:pPr>
+      <w:r>
+        <w:rPr>
+          <w:rtl w:val="0"/>
+        </w:rPr>
+        <w:t xml:space="preserve">exportaciones públicas exactas;</w:t>
+      </w:r>
+    </w:p>
+    <w:p>
+      <w:pPr>
+        <w:numPr>
+          <w:ilvl w:val="0"/>
+          <w:numId w:val="5"/>
+        </w:numPr>
+        <w:spacing w:after="0" w:afterAutospacing="0" w:before="0" w:beforeAutospacing="0" w:lineRule="auto"/>
+        <w:ind w:left="720" w:hanging="360"/>
+      </w:pPr>
+      <w:r>
+        <w:rPr>
+          <w:rtl w:val="0"/>
+        </w:rPr>
+        <w:t xml:space="preserve">jerarquía exacta de excepciones;</w:t>
+      </w:r>
+    </w:p>
+    <w:p>
+      <w:pPr>
+        <w:numPr>
+          <w:ilvl w:val="0"/>
+          <w:numId w:val="5"/>
+        </w:numPr>
+        <w:spacing w:after="240" w:before="0" w:beforeAutospacing="0" w:lineRule="auto"/>
+        <w:ind w:left="720" w:hanging="360"/>
+      </w:pPr>
+      <w:r>
+        <w:rPr>
+          <w:rtl w:val="0"/>
+        </w:rPr>
+        <w:t xml:space="preserve">cada categoría de error produce la excepción correspondiente.</w:t>
       </w:r>
     </w:p>
     <w:p>
@@ -6659,103 +7980,103 @@
       <w:lvlText w:val="●"/>
       <w:lvlJc w:val="left"/>
       <w:pPr>
+        <w:ind w:left="720" w:hanging="360"/>
+      </w:pPr>
+      <w:rPr>
+        <w:u w:val="none"/>
+      </w:rPr>
+    </w:lvl>
+    <w:lvl w:ilvl="1">
+      <w:start w:val="1"/>
+      <w:numFmt w:val="bullet"/>
+      <w:lvlText w:val="○"/>
+      <w:lvlJc w:val="left"/>
+      <w:pPr>
         <w:ind w:left="1440" w:hanging="360"/>
       </w:pPr>
       <w:rPr>
         <w:u w:val="none"/>
       </w:rPr>
     </w:lvl>
-    <w:lvl w:ilvl="1">
+    <w:lvl w:ilvl="2">
+      <w:start w:val="1"/>
+      <w:numFmt w:val="bullet"/>
+      <w:lvlText w:val="■"/>
+      <w:lvlJc w:val="left"/>
+      <w:pPr>
+        <w:ind w:left="2160" w:hanging="360"/>
+      </w:pPr>
+      <w:rPr>
+        <w:u w:val="none"/>
+      </w:rPr>
+    </w:lvl>
+    <w:lvl w:ilvl="3">
+      <w:start w:val="1"/>
+      <w:numFmt w:val="bullet"/>
+      <w:lvlText w:val="●"/>
+      <w:lvlJc w:val="left"/>
+      <w:pPr>
+        <w:ind w:left="2880" w:hanging="360"/>
+      </w:pPr>
+      <w:rPr>
+        <w:u w:val="none"/>
+      </w:rPr>
+    </w:lvl>
+    <w:lvl w:ilvl="4">
       <w:start w:val="1"/>
       <w:numFmt w:val="bullet"/>
       <w:lvlText w:val="○"/>
       <w:lvlJc w:val="left"/>
       <w:pPr>
-        <w:ind w:left="2160" w:hanging="360"/>
-      </w:pPr>
-      <w:rPr>
-        <w:u w:val="none"/>
-      </w:rPr>
-    </w:lvl>
-    <w:lvl w:ilvl="2">
+        <w:ind w:left="3600" w:hanging="360"/>
+      </w:pPr>
+      <w:rPr>
+        <w:u w:val="none"/>
+      </w:rPr>
+    </w:lvl>
+    <w:lvl w:ilvl="5">
       <w:start w:val="1"/>
       <w:numFmt w:val="bullet"/>
       <w:lvlText w:val="■"/>
       <w:lvlJc w:val="left"/>
       <w:pPr>
-        <w:ind w:left="2880" w:hanging="360"/>
-      </w:pPr>
-      <w:rPr>
-        <w:u w:val="none"/>
-      </w:rPr>
-    </w:lvl>
-    <w:lvl w:ilvl="3">
+        <w:ind w:left="4320" w:hanging="360"/>
+      </w:pPr>
+      <w:rPr>
+        <w:u w:val="none"/>
+      </w:rPr>
+    </w:lvl>
+    <w:lvl w:ilvl="6">
       <w:start w:val="1"/>
       <w:numFmt w:val="bullet"/>
       <w:lvlText w:val="●"/>
       <w:lvlJc w:val="left"/>
       <w:pPr>
-        <w:ind w:left="3600" w:hanging="360"/>
-      </w:pPr>
-      <w:rPr>
-        <w:u w:val="none"/>
-      </w:rPr>
-    </w:lvl>
-    <w:lvl w:ilvl="4">
+        <w:ind w:left="5040" w:hanging="360"/>
+      </w:pPr>
+      <w:rPr>
+        <w:u w:val="none"/>
+      </w:rPr>
+    </w:lvl>
+    <w:lvl w:ilvl="7">
       <w:start w:val="1"/>
       <w:numFmt w:val="bullet"/>
       <w:lvlText w:val="○"/>
       <w:lvlJc w:val="left"/>
       <w:pPr>
-        <w:ind w:left="4320" w:hanging="360"/>
-      </w:pPr>
-      <w:rPr>
-        <w:u w:val="none"/>
-      </w:rPr>
-    </w:lvl>
-    <w:lvl w:ilvl="5">
+        <w:ind w:left="5760" w:hanging="360"/>
+      </w:pPr>
+      <w:rPr>
+        <w:u w:val="none"/>
+      </w:rPr>
+    </w:lvl>
+    <w:lvl w:ilvl="8">
       <w:start w:val="1"/>
       <w:numFmt w:val="bullet"/>
       <w:lvlText w:val="■"/>
       <w:lvlJc w:val="left"/>
       <w:pPr>
-        <w:ind w:left="5040" w:hanging="360"/>
-      </w:pPr>
-      <w:rPr>
-        <w:u w:val="none"/>
-      </w:rPr>
-    </w:lvl>
-    <w:lvl w:ilvl="6">
-      <w:start w:val="1"/>
-      <w:numFmt w:val="bullet"/>
-      <w:lvlText w:val="●"/>
-      <w:lvlJc w:val="left"/>
-      <w:pPr>
-        <w:ind w:left="5760" w:hanging="360"/>
-      </w:pPr>
-      <w:rPr>
-        <w:u w:val="none"/>
-      </w:rPr>
-    </w:lvl>
-    <w:lvl w:ilvl="7">
-      <w:start w:val="1"/>
-      <w:numFmt w:val="bullet"/>
-      <w:lvlText w:val="○"/>
-      <w:lvlJc w:val="left"/>
-      <w:pPr>
         <w:ind w:left="6480" w:hanging="360"/>
-      </w:pPr>
-      <w:rPr>
-        <w:u w:val="none"/>
-      </w:rPr>
-    </w:lvl>
-    <w:lvl w:ilvl="8">
-      <w:start w:val="1"/>
-      <w:numFmt w:val="bullet"/>
-      <w:lvlText w:val="■"/>
-      <w:lvlJc w:val="left"/>
-      <w:pPr>
-        <w:ind w:left="7200" w:hanging="360"/>
       </w:pPr>
       <w:rPr>
         <w:u w:val="none"/>
@@ -6769,7 +8090,7 @@
       <w:lvlText w:val="●"/>
       <w:lvlJc w:val="left"/>
       <w:pPr>
-        <w:ind w:left="720" w:hanging="360"/>
+        <w:ind w:left="1440" w:hanging="360"/>
       </w:pPr>
       <w:rPr>
         <w:u w:val="none"/>
@@ -6781,7 +8102,7 @@
       <w:lvlText w:val="○"/>
       <w:lvlJc w:val="left"/>
       <w:pPr>
-        <w:ind w:left="1440" w:hanging="360"/>
+        <w:ind w:left="2160" w:hanging="360"/>
       </w:pPr>
       <w:rPr>
         <w:u w:val="none"/>
@@ -6793,7 +8114,7 @@
       <w:lvlText w:val="■"/>
       <w:lvlJc w:val="left"/>
       <w:pPr>
-        <w:ind w:left="2160" w:hanging="360"/>
+        <w:ind w:left="2880" w:hanging="360"/>
       </w:pPr>
       <w:rPr>
         <w:u w:val="none"/>
@@ -6805,7 +8126,7 @@
       <w:lvlText w:val="●"/>
       <w:lvlJc w:val="left"/>
       <w:pPr>
-        <w:ind w:left="2880" w:hanging="360"/>
+        <w:ind w:left="3600" w:hanging="360"/>
       </w:pPr>
       <w:rPr>
         <w:u w:val="none"/>
@@ -6817,7 +8138,7 @@
       <w:lvlText w:val="○"/>
       <w:lvlJc w:val="left"/>
       <w:pPr>
-        <w:ind w:left="3600" w:hanging="360"/>
+        <w:ind w:left="4320" w:hanging="360"/>
       </w:pPr>
       <w:rPr>
         <w:u w:val="none"/>
@@ -6829,7 +8150,7 @@
       <w:lvlText w:val="■"/>
       <w:lvlJc w:val="left"/>
       <w:pPr>
-        <w:ind w:left="4320" w:hanging="360"/>
+        <w:ind w:left="5040" w:hanging="360"/>
       </w:pPr>
       <w:rPr>
         <w:u w:val="none"/>
@@ -6841,7 +8162,7 @@
       <w:lvlText w:val="●"/>
       <w:lvlJc w:val="left"/>
       <w:pPr>
-        <w:ind w:left="5040" w:hanging="360"/>
+        <w:ind w:left="5760" w:hanging="360"/>
       </w:pPr>
       <w:rPr>
         <w:u w:val="none"/>
@@ -6853,7 +8174,7 @@
       <w:lvlText w:val="○"/>
       <w:lvlJc w:val="left"/>
       <w:pPr>
-        <w:ind w:left="5760" w:hanging="360"/>
+        <w:ind w:left="6480" w:hanging="360"/>
       </w:pPr>
       <w:rPr>
         <w:u w:val="none"/>
@@ -6865,7 +8186,7 @@
       <w:lvlText w:val="■"/>
       <w:lvlJc w:val="left"/>
       <w:pPr>
-        <w:ind w:left="6480" w:hanging="360"/>
+        <w:ind w:left="7200" w:hanging="360"/>
       </w:pPr>
       <w:rPr>
         <w:u w:val="none"/>
@@ -7093,6 +8414,116 @@
     </w:lvl>
   </w:abstractNum>
   <w:abstractNum w:abstractNumId="20">
+    <w:lvl w:ilvl="0">
+      <w:start w:val="1"/>
+      <w:numFmt w:val="bullet"/>
+      <w:lvlText w:val="●"/>
+      <w:lvlJc w:val="left"/>
+      <w:pPr>
+        <w:ind w:left="720" w:hanging="360"/>
+      </w:pPr>
+      <w:rPr>
+        <w:u w:val="none"/>
+      </w:rPr>
+    </w:lvl>
+    <w:lvl w:ilvl="1">
+      <w:start w:val="1"/>
+      <w:numFmt w:val="bullet"/>
+      <w:lvlText w:val="○"/>
+      <w:lvlJc w:val="left"/>
+      <w:pPr>
+        <w:ind w:left="1440" w:hanging="360"/>
+      </w:pPr>
+      <w:rPr>
+        <w:u w:val="none"/>
+      </w:rPr>
+    </w:lvl>
+    <w:lvl w:ilvl="2">
+      <w:start w:val="1"/>
+      <w:numFmt w:val="bullet"/>
+      <w:lvlText w:val="■"/>
+      <w:lvlJc w:val="left"/>
+      <w:pPr>
+        <w:ind w:left="2160" w:hanging="360"/>
+      </w:pPr>
+      <w:rPr>
+        <w:u w:val="none"/>
+      </w:rPr>
+    </w:lvl>
+    <w:lvl w:ilvl="3">
+      <w:start w:val="1"/>
+      <w:numFmt w:val="bullet"/>
+      <w:lvlText w:val="●"/>
+      <w:lvlJc w:val="left"/>
+      <w:pPr>
+        <w:ind w:left="2880" w:hanging="360"/>
+      </w:pPr>
+      <w:rPr>
+        <w:u w:val="none"/>
+      </w:rPr>
+    </w:lvl>
+    <w:lvl w:ilvl="4">
+      <w:start w:val="1"/>
+      <w:numFmt w:val="bullet"/>
+      <w:lvlText w:val="○"/>
+      <w:lvlJc w:val="left"/>
+      <w:pPr>
+        <w:ind w:left="3600" w:hanging="360"/>
+      </w:pPr>
+      <w:rPr>
+        <w:u w:val="none"/>
+      </w:rPr>
+    </w:lvl>
+    <w:lvl w:ilvl="5">
+      <w:start w:val="1"/>
+      <w:numFmt w:val="bullet"/>
+      <w:lvlText w:val="■"/>
+      <w:lvlJc w:val="left"/>
+      <w:pPr>
+        <w:ind w:left="4320" w:hanging="360"/>
+      </w:pPr>
+      <w:rPr>
+        <w:u w:val="none"/>
+      </w:rPr>
+    </w:lvl>
+    <w:lvl w:ilvl="6">
+      <w:start w:val="1"/>
+      <w:numFmt w:val="bullet"/>
+      <w:lvlText w:val="●"/>
+      <w:lvlJc w:val="left"/>
+      <w:pPr>
+        <w:ind w:left="5040" w:hanging="360"/>
+      </w:pPr>
+      <w:rPr>
+        <w:u w:val="none"/>
+      </w:rPr>
+    </w:lvl>
+    <w:lvl w:ilvl="7">
+      <w:start w:val="1"/>
+      <w:numFmt w:val="bullet"/>
+      <w:lvlText w:val="○"/>
+      <w:lvlJc w:val="left"/>
+      <w:pPr>
+        <w:ind w:left="5760" w:hanging="360"/>
+      </w:pPr>
+      <w:rPr>
+        <w:u w:val="none"/>
+      </w:rPr>
+    </w:lvl>
+    <w:lvl w:ilvl="8">
+      <w:start w:val="1"/>
+      <w:numFmt w:val="bullet"/>
+      <w:lvlText w:val="■"/>
+      <w:lvlJc w:val="left"/>
+      <w:pPr>
+        <w:ind w:left="6480" w:hanging="360"/>
+      </w:pPr>
+      <w:rPr>
+        <w:u w:val="none"/>
+      </w:rPr>
+    </w:lvl>
+  </w:abstractNum>
+  <w:abstractNum w:abstractNumId="21">
     <w:lvl w:ilvl="0">
       <w:start w:val="1"/>
       <w:numFmt w:val="bullet"/>
@@ -7261,6 +8692,9 @@
   </w:num>
   <w:num w:numId="20">
     <w:abstractNumId w:val="20"/>
+  </w:num>
+  <w:num w:numId="21">
+    <w:abstractNumId w:val="21"/>
   </w:num>
 </w:numbering>
 </file>

</xml_diff>